<commit_message>
:bookmark: update doc tcc II
</commit_message>
<xml_diff>
--- a/TCC II/[2025] TCC 2/TCC II - IasminMarques.docx
+++ b/TCC II/[2025] TCC 2/TCC II - IasminMarques.docx
@@ -596,7 +596,6 @@
           <w:highlight w:val="yellow"/>
         </w:rPr>
       </w:pPr>
-      <w:proofErr w:type="gramStart"/>
       <w:r>
         <w:rPr>
           <w:color w:val="172938"/>
@@ -612,7 +611,6 @@
         </w:rPr>
         <w:t>ficha</w:t>
       </w:r>
-      <w:proofErr w:type="gramEnd"/>
       <w:r>
         <w:rPr>
           <w:color w:val="172938"/>
@@ -1036,27 +1034,7 @@
                           <w:sz w:val="28"/>
                           <w:szCs w:val="28"/>
                         </w:rPr>
-                        <w:t xml:space="preserve"> </w:t>
-                      </w:r>
-                      <w:proofErr w:type="spellStart"/>
-                      <w:r>
-                        <w:rPr>
-                          <w:b/>
-                          <w:color w:val="FF0000"/>
-                          <w:sz w:val="28"/>
-                          <w:szCs w:val="28"/>
-                        </w:rPr>
-                        <w:t>pré</w:t>
-                      </w:r>
-                      <w:proofErr w:type="spellEnd"/>
-                      <w:r>
-                        <w:rPr>
-                          <w:b/>
-                          <w:color w:val="FF0000"/>
-                          <w:sz w:val="28"/>
-                          <w:szCs w:val="28"/>
-                        </w:rPr>
-                        <w:t>-textual o</w:t>
+                        <w:t xml:space="preserve"> pré-textual o</w:t>
                       </w:r>
                       <w:r>
                         <w:rPr>
@@ -2086,7 +2064,6 @@
                         </w:rPr>
                         <w:t xml:space="preserve">  elemento </w:t>
                       </w:r>
-                      <w:proofErr w:type="spellStart"/>
                       <w:r>
                         <w:rPr>
                           <w:b/>
@@ -2094,17 +2071,7 @@
                           <w:sz w:val="28"/>
                           <w:szCs w:val="28"/>
                         </w:rPr>
-                        <w:t>pré</w:t>
-                      </w:r>
-                      <w:proofErr w:type="spellEnd"/>
-                      <w:r>
-                        <w:rPr>
-                          <w:b/>
-                          <w:color w:val="FF0000"/>
-                          <w:sz w:val="28"/>
-                          <w:szCs w:val="28"/>
-                        </w:rPr>
-                        <w:t>-textual opcional</w:t>
+                        <w:t>pré-textual opcional</w:t>
                       </w:r>
                     </w:p>
                   </w:txbxContent>
@@ -2641,17 +2608,8 @@
           <w:bCs/>
           <w:kern w:val="32"/>
         </w:rPr>
-        <w:t xml:space="preserve"> </w:t>
-      </w:r>
-      <w:proofErr w:type="gramStart"/>
-      <w:r>
-        <w:rPr>
-          <w:bCs/>
-          <w:kern w:val="32"/>
-        </w:rPr>
-        <w:t>Normalização  bibliográfica</w:t>
-      </w:r>
-      <w:proofErr w:type="gramEnd"/>
+        <w:t xml:space="preserve"> Normalização  bibliográfica</w:t>
+      </w:r>
     </w:p>
     <w:p>
       <w:pPr>
@@ -2725,37 +2683,13 @@
         <w:contextualSpacing/>
       </w:pPr>
       <w:r>
-        <w:t xml:space="preserve">Elemento obrigatório para trabalhos de conclusão de curso (graduação </w:t>
-      </w:r>
-      <w:proofErr w:type="gramStart"/>
-      <w:r>
-        <w:t>ou  especialização</w:t>
-      </w:r>
-      <w:proofErr w:type="gramEnd"/>
-      <w:r>
-        <w:t xml:space="preserve">), mestrado e doutorado. É a </w:t>
-      </w:r>
-      <w:proofErr w:type="gramStart"/>
-      <w:r>
-        <w:t>versão  do</w:t>
-      </w:r>
-      <w:proofErr w:type="gramEnd"/>
-      <w:r>
-        <w:t xml:space="preserve"> resumo em português para outro idioma</w:t>
+        <w:t>Elemento obrigatório para trabalhos de conclusão de curso (graduação ou  especialização), mestrado e doutorado. É a versão  do resumo em português para outro idioma</w:t>
       </w:r>
       <w:r>
         <w:t>, neste exemplo em inglês.</w:t>
       </w:r>
       <w:r>
-        <w:t xml:space="preserve"> Deve aparecer em página distinta e seguindo a mesma formatação do resumo em português. A versão das palavras-chave em outro idioma deve seguir a mesma formatação utilizada no resumo </w:t>
-      </w:r>
-      <w:proofErr w:type="gramStart"/>
-      <w:r>
-        <w:t>em  português</w:t>
-      </w:r>
-      <w:proofErr w:type="gramEnd"/>
-      <w:r>
-        <w:t xml:space="preserve">. </w:t>
+        <w:t xml:space="preserve"> Deve aparecer em página distinta e seguindo a mesma formatação do resumo em português. A versão das palavras-chave em outro idioma deve seguir a mesma formatação utilizada no resumo em  português. </w:t>
       </w:r>
       <w:r>
         <w:rPr>
@@ -3817,7 +3751,7 @@
           <w:r>
             <w:fldChar w:fldCharType="separate"/>
           </w:r>
-          <w:hyperlink w:anchor="_Toc203572592" w:history="1">
+          <w:hyperlink w:anchor="_Toc205138854" w:history="1">
             <w:r>
               <w:rPr>
                 <w:rStyle w:val="Hyperlink"/>
@@ -3862,7 +3796,7 @@
                 <w:noProof/>
                 <w:webHidden/>
               </w:rPr>
-              <w:instrText xml:space="preserve"> PAGEREF _Toc203572592 \h </w:instrText>
+              <w:instrText xml:space="preserve"> PAGEREF _Toc205138854 \h </w:instrText>
             </w:r>
             <w:r>
               <w:rPr>
@@ -3903,7 +3837,7 @@
               <w:lang w:eastAsia="pt-BR"/>
             </w:rPr>
           </w:pPr>
-          <w:hyperlink w:anchor="_Toc203572593" w:history="1">
+          <w:hyperlink w:anchor="_Toc205138855" w:history="1">
             <w:r>
               <w:rPr>
                 <w:rStyle w:val="Hyperlink"/>
@@ -3946,7 +3880,7 @@
                 <w:noProof/>
                 <w:webHidden/>
               </w:rPr>
-              <w:instrText xml:space="preserve"> PAGEREF _Toc203572593 \h </w:instrText>
+              <w:instrText xml:space="preserve"> PAGEREF _Toc205138855 \h </w:instrText>
             </w:r>
             <w:r>
               <w:rPr>
@@ -3987,7 +3921,7 @@
               <w:lang w:eastAsia="pt-BR"/>
             </w:rPr>
           </w:pPr>
-          <w:hyperlink w:anchor="_Toc203572594" w:history="1">
+          <w:hyperlink w:anchor="_Toc205138856" w:history="1">
             <w:r>
               <w:rPr>
                 <w:rStyle w:val="Hyperlink"/>
@@ -4030,7 +3964,7 @@
                 <w:noProof/>
                 <w:webHidden/>
               </w:rPr>
-              <w:instrText xml:space="preserve"> PAGEREF _Toc203572594 \h </w:instrText>
+              <w:instrText xml:space="preserve"> PAGEREF _Toc205138856 \h </w:instrText>
             </w:r>
             <w:r>
               <w:rPr>
@@ -4071,7 +4005,7 @@
               <w:lang w:eastAsia="pt-BR"/>
             </w:rPr>
           </w:pPr>
-          <w:hyperlink w:anchor="_Toc203572595" w:history="1">
+          <w:hyperlink w:anchor="_Toc205138857" w:history="1">
             <w:r>
               <w:rPr>
                 <w:rStyle w:val="Hyperlink"/>
@@ -4114,7 +4048,7 @@
                 <w:noProof/>
                 <w:webHidden/>
               </w:rPr>
-              <w:instrText xml:space="preserve"> PAGEREF _Toc203572595 \h </w:instrText>
+              <w:instrText xml:space="preserve"> PAGEREF _Toc205138857 \h </w:instrText>
             </w:r>
             <w:r>
               <w:rPr>
@@ -4155,7 +4089,7 @@
               <w:lang w:eastAsia="pt-BR"/>
             </w:rPr>
           </w:pPr>
-          <w:hyperlink w:anchor="_Toc203572596" w:history="1">
+          <w:hyperlink w:anchor="_Toc205138858" w:history="1">
             <w:r>
               <w:rPr>
                 <w:rStyle w:val="Hyperlink"/>
@@ -4198,7 +4132,7 @@
                 <w:noProof/>
                 <w:webHidden/>
               </w:rPr>
-              <w:instrText xml:space="preserve"> PAGEREF _Toc203572596 \h </w:instrText>
+              <w:instrText xml:space="preserve"> PAGEREF _Toc205138858 \h </w:instrText>
             </w:r>
             <w:r>
               <w:rPr>
@@ -4218,7 +4152,7 @@
                 <w:noProof/>
                 <w:webHidden/>
               </w:rPr>
-              <w:t>3</w:t>
+              <w:t>4</w:t>
             </w:r>
             <w:r>
               <w:rPr>
@@ -4239,7 +4173,7 @@
               <w:lang w:eastAsia="pt-BR"/>
             </w:rPr>
           </w:pPr>
-          <w:hyperlink w:anchor="_Toc203572597" w:history="1">
+          <w:hyperlink w:anchor="_Toc205138859" w:history="1">
             <w:r>
               <w:rPr>
                 <w:rStyle w:val="Hyperlink"/>
@@ -4282,7 +4216,7 @@
                 <w:noProof/>
                 <w:webHidden/>
               </w:rPr>
-              <w:instrText xml:space="preserve"> PAGEREF _Toc203572597 \h </w:instrText>
+              <w:instrText xml:space="preserve"> PAGEREF _Toc205138859 \h </w:instrText>
             </w:r>
             <w:r>
               <w:rPr>
@@ -4323,7 +4257,7 @@
               <w:lang w:eastAsia="pt-BR"/>
             </w:rPr>
           </w:pPr>
-          <w:hyperlink w:anchor="_Toc203572598" w:history="1">
+          <w:hyperlink w:anchor="_Toc205138860" w:history="1">
             <w:r>
               <w:rPr>
                 <w:rStyle w:val="Hyperlink"/>
@@ -4366,7 +4300,7 @@
                 <w:noProof/>
                 <w:webHidden/>
               </w:rPr>
-              <w:instrText xml:space="preserve"> PAGEREF _Toc203572598 \h </w:instrText>
+              <w:instrText xml:space="preserve"> PAGEREF _Toc205138860 \h </w:instrText>
             </w:r>
             <w:r>
               <w:rPr>
@@ -4407,7 +4341,7 @@
               <w:lang w:eastAsia="pt-BR"/>
             </w:rPr>
           </w:pPr>
-          <w:hyperlink w:anchor="_Toc203572599" w:history="1">
+          <w:hyperlink w:anchor="_Toc205138861" w:history="1">
             <w:r>
               <w:rPr>
                 <w:rStyle w:val="Hyperlink"/>
@@ -4450,7 +4384,7 @@
                 <w:noProof/>
                 <w:webHidden/>
               </w:rPr>
-              <w:instrText xml:space="preserve"> PAGEREF _Toc203572599 \h </w:instrText>
+              <w:instrText xml:space="preserve"> PAGEREF _Toc205138861 \h </w:instrText>
             </w:r>
             <w:r>
               <w:rPr>
@@ -4491,7 +4425,7 @@
               <w:lang w:eastAsia="pt-BR"/>
             </w:rPr>
           </w:pPr>
-          <w:hyperlink w:anchor="_Toc203572600" w:history="1">
+          <w:hyperlink w:anchor="_Toc205138862" w:history="1">
             <w:r>
               <w:rPr>
                 <w:rStyle w:val="Hyperlink"/>
@@ -4534,7 +4468,7 @@
                 <w:noProof/>
                 <w:webHidden/>
               </w:rPr>
-              <w:instrText xml:space="preserve"> PAGEREF _Toc203572600 \h </w:instrText>
+              <w:instrText xml:space="preserve"> PAGEREF _Toc205138862 \h </w:instrText>
             </w:r>
             <w:r>
               <w:rPr>
@@ -4575,7 +4509,7 @@
               <w:lang w:eastAsia="pt-BR"/>
             </w:rPr>
           </w:pPr>
-          <w:hyperlink w:anchor="_Toc203572601" w:history="1">
+          <w:hyperlink w:anchor="_Toc205138863" w:history="1">
             <w:r>
               <w:rPr>
                 <w:rStyle w:val="Hyperlink"/>
@@ -4618,7 +4552,7 @@
                 <w:noProof/>
                 <w:webHidden/>
               </w:rPr>
-              <w:instrText xml:space="preserve"> PAGEREF _Toc203572601 \h </w:instrText>
+              <w:instrText xml:space="preserve"> PAGEREF _Toc205138863 \h </w:instrText>
             </w:r>
             <w:r>
               <w:rPr>
@@ -4659,7 +4593,7 @@
               <w:lang w:eastAsia="pt-BR"/>
             </w:rPr>
           </w:pPr>
-          <w:hyperlink w:anchor="_Toc203572602" w:history="1">
+          <w:hyperlink w:anchor="_Toc205138864" w:history="1">
             <w:r>
               <w:rPr>
                 <w:rStyle w:val="Hyperlink"/>
@@ -4702,7 +4636,7 @@
                 <w:noProof/>
                 <w:webHidden/>
               </w:rPr>
-              <w:instrText xml:space="preserve"> PAGEREF _Toc203572602 \h </w:instrText>
+              <w:instrText xml:space="preserve"> PAGEREF _Toc205138864 \h </w:instrText>
             </w:r>
             <w:r>
               <w:rPr>
@@ -4743,7 +4677,7 @@
               <w:lang w:eastAsia="pt-BR"/>
             </w:rPr>
           </w:pPr>
-          <w:hyperlink w:anchor="_Toc203572603" w:history="1">
+          <w:hyperlink w:anchor="_Toc205138865" w:history="1">
             <w:r>
               <w:rPr>
                 <w:rStyle w:val="Hyperlink"/>
@@ -4786,7 +4720,7 @@
                 <w:noProof/>
                 <w:webHidden/>
               </w:rPr>
-              <w:instrText xml:space="preserve"> PAGEREF _Toc203572603 \h </w:instrText>
+              <w:instrText xml:space="preserve"> PAGEREF _Toc205138865 \h </w:instrText>
             </w:r>
             <w:r>
               <w:rPr>
@@ -4827,7 +4761,7 @@
               <w:lang w:eastAsia="pt-BR"/>
             </w:rPr>
           </w:pPr>
-          <w:hyperlink w:anchor="_Toc203572604" w:history="1">
+          <w:hyperlink w:anchor="_Toc205138866" w:history="1">
             <w:r>
               <w:rPr>
                 <w:rStyle w:val="Hyperlink"/>
@@ -4870,7 +4804,7 @@
                 <w:noProof/>
                 <w:webHidden/>
               </w:rPr>
-              <w:instrText xml:space="preserve"> PAGEREF _Toc203572604 \h </w:instrText>
+              <w:instrText xml:space="preserve"> PAGEREF _Toc205138866 \h </w:instrText>
             </w:r>
             <w:r>
               <w:rPr>
@@ -4911,7 +4845,7 @@
               <w:lang w:eastAsia="pt-BR"/>
             </w:rPr>
           </w:pPr>
-          <w:hyperlink w:anchor="_Toc203572605" w:history="1">
+          <w:hyperlink w:anchor="_Toc205138867" w:history="1">
             <w:r>
               <w:rPr>
                 <w:rStyle w:val="Hyperlink"/>
@@ -4954,7 +4888,7 @@
                 <w:noProof/>
                 <w:webHidden/>
               </w:rPr>
-              <w:instrText xml:space="preserve"> PAGEREF _Toc203572605 \h </w:instrText>
+              <w:instrText xml:space="preserve"> PAGEREF _Toc205138867 \h </w:instrText>
             </w:r>
             <w:r>
               <w:rPr>
@@ -4995,7 +4929,7 @@
               <w:lang w:eastAsia="pt-BR"/>
             </w:rPr>
           </w:pPr>
-          <w:hyperlink w:anchor="_Toc203572606" w:history="1">
+          <w:hyperlink w:anchor="_Toc205138868" w:history="1">
             <w:r>
               <w:rPr>
                 <w:rStyle w:val="Hyperlink"/>
@@ -5038,7 +4972,7 @@
                 <w:noProof/>
                 <w:webHidden/>
               </w:rPr>
-              <w:instrText xml:space="preserve"> PAGEREF _Toc203572606 \h </w:instrText>
+              <w:instrText xml:space="preserve"> PAGEREF _Toc205138868 \h </w:instrText>
             </w:r>
             <w:r>
               <w:rPr>
@@ -5079,7 +5013,7 @@
               <w:lang w:eastAsia="pt-BR"/>
             </w:rPr>
           </w:pPr>
-          <w:hyperlink w:anchor="_Toc203572607" w:history="1">
+          <w:hyperlink w:anchor="_Toc205138869" w:history="1">
             <w:r>
               <w:rPr>
                 <w:rStyle w:val="Hyperlink"/>
@@ -5122,7 +5056,7 @@
                 <w:noProof/>
                 <w:webHidden/>
               </w:rPr>
-              <w:instrText xml:space="preserve"> PAGEREF _Toc203572607 \h </w:instrText>
+              <w:instrText xml:space="preserve"> PAGEREF _Toc205138869 \h </w:instrText>
             </w:r>
             <w:r>
               <w:rPr>
@@ -5163,7 +5097,7 @@
               <w:lang w:eastAsia="pt-BR"/>
             </w:rPr>
           </w:pPr>
-          <w:hyperlink w:anchor="_Toc203572608" w:history="1">
+          <w:hyperlink w:anchor="_Toc205138870" w:history="1">
             <w:r>
               <w:rPr>
                 <w:rStyle w:val="Hyperlink"/>
@@ -5206,7 +5140,7 @@
                 <w:noProof/>
                 <w:webHidden/>
               </w:rPr>
-              <w:instrText xml:space="preserve"> PAGEREF _Toc203572608 \h </w:instrText>
+              <w:instrText xml:space="preserve"> PAGEREF _Toc205138870 \h </w:instrText>
             </w:r>
             <w:r>
               <w:rPr>
@@ -5247,7 +5181,7 @@
               <w:lang w:eastAsia="pt-BR"/>
             </w:rPr>
           </w:pPr>
-          <w:hyperlink w:anchor="_Toc203572609" w:history="1">
+          <w:hyperlink w:anchor="_Toc205138871" w:history="1">
             <w:r>
               <w:rPr>
                 <w:rStyle w:val="Hyperlink"/>
@@ -5290,7 +5224,7 @@
                 <w:noProof/>
                 <w:webHidden/>
               </w:rPr>
-              <w:instrText xml:space="preserve"> PAGEREF _Toc203572609 \h </w:instrText>
+              <w:instrText xml:space="preserve"> PAGEREF _Toc205138871 \h </w:instrText>
             </w:r>
             <w:r>
               <w:rPr>
@@ -5331,7 +5265,7 @@
               <w:lang w:eastAsia="pt-BR"/>
             </w:rPr>
           </w:pPr>
-          <w:hyperlink w:anchor="_Toc203572610" w:history="1">
+          <w:hyperlink w:anchor="_Toc205138872" w:history="1">
             <w:r>
               <w:rPr>
                 <w:rStyle w:val="Hyperlink"/>
@@ -5374,7 +5308,7 @@
                 <w:noProof/>
                 <w:webHidden/>
               </w:rPr>
-              <w:instrText xml:space="preserve"> PAGEREF _Toc203572610 \h </w:instrText>
+              <w:instrText xml:space="preserve"> PAGEREF _Toc205138872 \h </w:instrText>
             </w:r>
             <w:r>
               <w:rPr>
@@ -5415,7 +5349,7 @@
               <w:lang w:eastAsia="pt-BR"/>
             </w:rPr>
           </w:pPr>
-          <w:hyperlink w:anchor="_Toc203572611" w:history="1">
+          <w:hyperlink w:anchor="_Toc205138873" w:history="1">
             <w:r>
               <w:rPr>
                 <w:rStyle w:val="Hyperlink"/>
@@ -5458,7 +5392,7 @@
                 <w:noProof/>
                 <w:webHidden/>
               </w:rPr>
-              <w:instrText xml:space="preserve"> PAGEREF _Toc203572611 \h </w:instrText>
+              <w:instrText xml:space="preserve"> PAGEREF _Toc205138873 \h </w:instrText>
             </w:r>
             <w:r>
               <w:rPr>
@@ -5499,7 +5433,7 @@
               <w:lang w:eastAsia="pt-BR"/>
             </w:rPr>
           </w:pPr>
-          <w:hyperlink w:anchor="_Toc203572612" w:history="1">
+          <w:hyperlink w:anchor="_Toc205138874" w:history="1">
             <w:r>
               <w:rPr>
                 <w:rStyle w:val="Hyperlink"/>
@@ -5544,7 +5478,7 @@
                 <w:noProof/>
                 <w:webHidden/>
               </w:rPr>
-              <w:instrText xml:space="preserve"> PAGEREF _Toc203572612 \h </w:instrText>
+              <w:instrText xml:space="preserve"> PAGEREF _Toc205138874 \h </w:instrText>
             </w:r>
             <w:r>
               <w:rPr>
@@ -5585,7 +5519,7 @@
               <w:lang w:eastAsia="pt-BR"/>
             </w:rPr>
           </w:pPr>
-          <w:hyperlink w:anchor="_Toc203572613" w:history="1">
+          <w:hyperlink w:anchor="_Toc205138875" w:history="1">
             <w:r>
               <w:rPr>
                 <w:rStyle w:val="Hyperlink"/>
@@ -5629,7 +5563,7 @@
                 <w:noProof/>
                 <w:webHidden/>
               </w:rPr>
-              <w:instrText xml:space="preserve"> PAGEREF _Toc203572613 \h </w:instrText>
+              <w:instrText xml:space="preserve"> PAGEREF _Toc205138875 \h </w:instrText>
             </w:r>
             <w:r>
               <w:rPr>
@@ -5670,7 +5604,7 @@
               <w:lang w:eastAsia="pt-BR"/>
             </w:rPr>
           </w:pPr>
-          <w:hyperlink w:anchor="_Toc203572614" w:history="1">
+          <w:hyperlink w:anchor="_Toc205138876" w:history="1">
             <w:r>
               <w:rPr>
                 <w:rStyle w:val="Hyperlink"/>
@@ -5715,7 +5649,7 @@
                 <w:noProof/>
                 <w:webHidden/>
               </w:rPr>
-              <w:instrText xml:space="preserve"> PAGEREF _Toc203572614 \h </w:instrText>
+              <w:instrText xml:space="preserve"> PAGEREF _Toc205138876 \h </w:instrText>
             </w:r>
             <w:r>
               <w:rPr>
@@ -5756,7 +5690,7 @@
               <w:lang w:eastAsia="pt-BR"/>
             </w:rPr>
           </w:pPr>
-          <w:hyperlink w:anchor="_Toc203572615" w:history="1">
+          <w:hyperlink w:anchor="_Toc205138877" w:history="1">
             <w:r>
               <w:rPr>
                 <w:rStyle w:val="Hyperlink"/>
@@ -5801,7 +5735,7 @@
                 <w:noProof/>
                 <w:webHidden/>
               </w:rPr>
-              <w:instrText xml:space="preserve"> PAGEREF _Toc203572615 \h </w:instrText>
+              <w:instrText xml:space="preserve"> PAGEREF _Toc205138877 \h </w:instrText>
             </w:r>
             <w:r>
               <w:rPr>
@@ -5842,7 +5776,7 @@
               <w:lang w:eastAsia="pt-BR"/>
             </w:rPr>
           </w:pPr>
-          <w:hyperlink w:anchor="_Toc203572616" w:history="1">
+          <w:hyperlink w:anchor="_Toc205138878" w:history="1">
             <w:r>
               <w:rPr>
                 <w:rStyle w:val="Hyperlink"/>
@@ -5887,7 +5821,7 @@
                 <w:noProof/>
                 <w:webHidden/>
               </w:rPr>
-              <w:instrText xml:space="preserve"> PAGEREF _Toc203572616 \h </w:instrText>
+              <w:instrText xml:space="preserve"> PAGEREF _Toc205138878 \h </w:instrText>
             </w:r>
             <w:r>
               <w:rPr>
@@ -5928,7 +5862,7 @@
               <w:lang w:eastAsia="pt-BR"/>
             </w:rPr>
           </w:pPr>
-          <w:hyperlink w:anchor="_Toc203572617" w:history="1">
+          <w:hyperlink w:anchor="_Toc205138879" w:history="1">
             <w:r>
               <w:rPr>
                 <w:rStyle w:val="Hyperlink"/>
@@ -5973,7 +5907,7 @@
                 <w:noProof/>
                 <w:webHidden/>
               </w:rPr>
-              <w:instrText xml:space="preserve"> PAGEREF _Toc203572617 \h </w:instrText>
+              <w:instrText xml:space="preserve"> PAGEREF _Toc205138879 \h </w:instrText>
             </w:r>
             <w:r>
               <w:rPr>
@@ -6014,7 +5948,7 @@
               <w:lang w:eastAsia="pt-BR"/>
             </w:rPr>
           </w:pPr>
-          <w:hyperlink w:anchor="_Toc203572618" w:history="1">
+          <w:hyperlink w:anchor="_Toc205138880" w:history="1">
             <w:r>
               <w:rPr>
                 <w:rStyle w:val="Hyperlink"/>
@@ -6059,7 +5993,7 @@
                 <w:noProof/>
                 <w:webHidden/>
               </w:rPr>
-              <w:instrText xml:space="preserve"> PAGEREF _Toc203572618 \h </w:instrText>
+              <w:instrText xml:space="preserve"> PAGEREF _Toc205138880 \h </w:instrText>
             </w:r>
             <w:r>
               <w:rPr>
@@ -6100,7 +6034,7 @@
               <w:lang w:eastAsia="pt-BR"/>
             </w:rPr>
           </w:pPr>
-          <w:hyperlink w:anchor="_Toc203572619" w:history="1">
+          <w:hyperlink w:anchor="_Toc205138881" w:history="1">
             <w:r>
               <w:rPr>
                 <w:rStyle w:val="Hyperlink"/>
@@ -6145,7 +6079,7 @@
                 <w:noProof/>
                 <w:webHidden/>
               </w:rPr>
-              <w:instrText xml:space="preserve"> PAGEREF _Toc203572619 \h </w:instrText>
+              <w:instrText xml:space="preserve"> PAGEREF _Toc205138881 \h </w:instrText>
             </w:r>
             <w:r>
               <w:rPr>
@@ -6186,7 +6120,7 @@
               <w:lang w:eastAsia="pt-BR"/>
             </w:rPr>
           </w:pPr>
-          <w:hyperlink w:anchor="_Toc203572620" w:history="1">
+          <w:hyperlink w:anchor="_Toc205138882" w:history="1">
             <w:r>
               <w:rPr>
                 <w:rStyle w:val="Hyperlink"/>
@@ -6231,7 +6165,7 @@
                 <w:noProof/>
                 <w:webHidden/>
               </w:rPr>
-              <w:instrText xml:space="preserve"> PAGEREF _Toc203572620 \h </w:instrText>
+              <w:instrText xml:space="preserve"> PAGEREF _Toc205138882 \h </w:instrText>
             </w:r>
             <w:r>
               <w:rPr>
@@ -6272,7 +6206,7 @@
               <w:lang w:eastAsia="pt-BR"/>
             </w:rPr>
           </w:pPr>
-          <w:hyperlink w:anchor="_Toc203572621" w:history="1">
+          <w:hyperlink w:anchor="_Toc205138883" w:history="1">
             <w:r>
               <w:rPr>
                 <w:rStyle w:val="Hyperlink"/>
@@ -6317,7 +6251,7 @@
                 <w:noProof/>
                 <w:webHidden/>
               </w:rPr>
-              <w:instrText xml:space="preserve"> PAGEREF _Toc203572621 \h </w:instrText>
+              <w:instrText xml:space="preserve"> PAGEREF _Toc205138883 \h </w:instrText>
             </w:r>
             <w:r>
               <w:rPr>
@@ -6358,7 +6292,7 @@
               <w:lang w:eastAsia="pt-BR"/>
             </w:rPr>
           </w:pPr>
-          <w:hyperlink w:anchor="_Toc203572622" w:history="1">
+          <w:hyperlink w:anchor="_Toc205138884" w:history="1">
             <w:r>
               <w:rPr>
                 <w:rStyle w:val="Hyperlink"/>
@@ -6403,7 +6337,7 @@
                 <w:noProof/>
                 <w:webHidden/>
               </w:rPr>
-              <w:instrText xml:space="preserve"> PAGEREF _Toc203572622 \h </w:instrText>
+              <w:instrText xml:space="preserve"> PAGEREF _Toc205138884 \h </w:instrText>
             </w:r>
             <w:r>
               <w:rPr>
@@ -6444,7 +6378,7 @@
               <w:lang w:eastAsia="pt-BR"/>
             </w:rPr>
           </w:pPr>
-          <w:hyperlink w:anchor="_Toc203572623" w:history="1">
+          <w:hyperlink w:anchor="_Toc205138885" w:history="1">
             <w:r>
               <w:rPr>
                 <w:rStyle w:val="Hyperlink"/>
@@ -6489,7 +6423,7 @@
                 <w:noProof/>
                 <w:webHidden/>
               </w:rPr>
-              <w:instrText xml:space="preserve"> PAGEREF _Toc203572623 \h </w:instrText>
+              <w:instrText xml:space="preserve"> PAGEREF _Toc205138885 \h </w:instrText>
             </w:r>
             <w:r>
               <w:rPr>
@@ -6530,7 +6464,7 @@
               <w:lang w:eastAsia="pt-BR"/>
             </w:rPr>
           </w:pPr>
-          <w:hyperlink w:anchor="_Toc203572624" w:history="1">
+          <w:hyperlink w:anchor="_Toc205138886" w:history="1">
             <w:r>
               <w:rPr>
                 <w:rStyle w:val="Hyperlink"/>
@@ -6575,7 +6509,7 @@
                 <w:noProof/>
                 <w:webHidden/>
               </w:rPr>
-              <w:instrText xml:space="preserve"> PAGEREF _Toc203572624 \h </w:instrText>
+              <w:instrText xml:space="preserve"> PAGEREF _Toc205138886 \h </w:instrText>
             </w:r>
             <w:r>
               <w:rPr>
@@ -6616,7 +6550,7 @@
               <w:lang w:eastAsia="pt-BR"/>
             </w:rPr>
           </w:pPr>
-          <w:hyperlink w:anchor="_Toc203572625" w:history="1">
+          <w:hyperlink w:anchor="_Toc205138887" w:history="1">
             <w:r>
               <w:rPr>
                 <w:rStyle w:val="Hyperlink"/>
@@ -6640,7 +6574,7 @@
                 <w:noProof/>
                 <w:highlight w:val="yellow"/>
               </w:rPr>
-              <w:t>Comparação dos Modelos Preditivos</w:t>
+              <w:t>Modelos Preditivos</w:t>
             </w:r>
             <w:r>
               <w:rPr>
@@ -6661,7 +6595,179 @@
                 <w:noProof/>
                 <w:webHidden/>
               </w:rPr>
-              <w:instrText xml:space="preserve"> PAGEREF _Toc203572625 \h </w:instrText>
+              <w:instrText xml:space="preserve"> PAGEREF _Toc205138887 \h </w:instrText>
+            </w:r>
+            <w:r>
+              <w:rPr>
+                <w:noProof/>
+                <w:webHidden/>
+              </w:rPr>
+            </w:r>
+            <w:r>
+              <w:rPr>
+                <w:noProof/>
+                <w:webHidden/>
+              </w:rPr>
+              <w:fldChar w:fldCharType="separate"/>
+            </w:r>
+            <w:r>
+              <w:rPr>
+                <w:noProof/>
+                <w:webHidden/>
+              </w:rPr>
+              <w:t>18</w:t>
+            </w:r>
+            <w:r>
+              <w:rPr>
+                <w:noProof/>
+                <w:webHidden/>
+              </w:rPr>
+              <w:fldChar w:fldCharType="end"/>
+            </w:r>
+          </w:hyperlink>
+        </w:p>
+        <w:p>
+          <w:pPr>
+            <w:pStyle w:val="Sumrio3"/>
+            <w:rPr>
+              <w:rFonts w:asciiTheme="minorHAnsi" w:eastAsiaTheme="minorEastAsia" w:hAnsiTheme="minorHAnsi"/>
+              <w:noProof/>
+              <w:sz w:val="22"/>
+              <w:lang w:eastAsia="pt-BR"/>
+            </w:rPr>
+          </w:pPr>
+          <w:hyperlink w:anchor="_Toc205138888" w:history="1">
+            <w:r>
+              <w:rPr>
+                <w:rStyle w:val="Hyperlink"/>
+                <w:noProof/>
+                <w:highlight w:val="yellow"/>
+              </w:rPr>
+              <w:t>4.1.1</w:t>
+            </w:r>
+            <w:r>
+              <w:rPr>
+                <w:rFonts w:asciiTheme="minorHAnsi" w:eastAsiaTheme="minorEastAsia" w:hAnsiTheme="minorHAnsi"/>
+                <w:noProof/>
+                <w:sz w:val="22"/>
+                <w:lang w:eastAsia="pt-BR"/>
+              </w:rPr>
+              <w:tab/>
+            </w:r>
+            <w:r>
+              <w:rPr>
+                <w:rStyle w:val="Hyperlink"/>
+                <w:noProof/>
+                <w:highlight w:val="yellow"/>
+              </w:rPr>
+              <w:t>Random Forest</w:t>
+            </w:r>
+            <w:r>
+              <w:rPr>
+                <w:noProof/>
+                <w:webHidden/>
+              </w:rPr>
+              <w:tab/>
+            </w:r>
+            <w:r>
+              <w:rPr>
+                <w:noProof/>
+                <w:webHidden/>
+              </w:rPr>
+              <w:fldChar w:fldCharType="begin"/>
+            </w:r>
+            <w:r>
+              <w:rPr>
+                <w:noProof/>
+                <w:webHidden/>
+              </w:rPr>
+              <w:instrText xml:space="preserve"> PAGEREF _Toc205138888 \h </w:instrText>
+            </w:r>
+            <w:r>
+              <w:rPr>
+                <w:noProof/>
+                <w:webHidden/>
+              </w:rPr>
+            </w:r>
+            <w:r>
+              <w:rPr>
+                <w:noProof/>
+                <w:webHidden/>
+              </w:rPr>
+              <w:fldChar w:fldCharType="separate"/>
+            </w:r>
+            <w:r>
+              <w:rPr>
+                <w:noProof/>
+                <w:webHidden/>
+              </w:rPr>
+              <w:t>18</w:t>
+            </w:r>
+            <w:r>
+              <w:rPr>
+                <w:noProof/>
+                <w:webHidden/>
+              </w:rPr>
+              <w:fldChar w:fldCharType="end"/>
+            </w:r>
+          </w:hyperlink>
+        </w:p>
+        <w:p>
+          <w:pPr>
+            <w:pStyle w:val="Sumrio3"/>
+            <w:rPr>
+              <w:rFonts w:asciiTheme="minorHAnsi" w:eastAsiaTheme="minorEastAsia" w:hAnsiTheme="minorHAnsi"/>
+              <w:noProof/>
+              <w:sz w:val="22"/>
+              <w:lang w:eastAsia="pt-BR"/>
+            </w:rPr>
+          </w:pPr>
+          <w:hyperlink w:anchor="_Toc205138889" w:history="1">
+            <w:r>
+              <w:rPr>
+                <w:rStyle w:val="Hyperlink"/>
+                <w:noProof/>
+                <w:highlight w:val="yellow"/>
+              </w:rPr>
+              <w:t>4.1.2</w:t>
+            </w:r>
+            <w:r>
+              <w:rPr>
+                <w:rFonts w:asciiTheme="minorHAnsi" w:eastAsiaTheme="minorEastAsia" w:hAnsiTheme="minorHAnsi"/>
+                <w:noProof/>
+                <w:sz w:val="22"/>
+                <w:lang w:eastAsia="pt-BR"/>
+              </w:rPr>
+              <w:tab/>
+            </w:r>
+            <w:r>
+              <w:rPr>
+                <w:rStyle w:val="Hyperlink"/>
+                <w:noProof/>
+                <w:highlight w:val="yellow"/>
+              </w:rPr>
+              <w:t>Cart</w:t>
+            </w:r>
+            <w:r>
+              <w:rPr>
+                <w:noProof/>
+                <w:webHidden/>
+              </w:rPr>
+              <w:tab/>
+            </w:r>
+            <w:r>
+              <w:rPr>
+                <w:noProof/>
+                <w:webHidden/>
+              </w:rPr>
+              <w:fldChar w:fldCharType="begin"/>
+            </w:r>
+            <w:r>
+              <w:rPr>
+                <w:noProof/>
+                <w:webHidden/>
+              </w:rPr>
+              <w:instrText xml:space="preserve"> PAGEREF _Toc205138889 \h </w:instrText>
             </w:r>
             <w:r>
               <w:rPr>
@@ -6702,7 +6808,7 @@
               <w:lang w:eastAsia="pt-BR"/>
             </w:rPr>
           </w:pPr>
-          <w:hyperlink w:anchor="_Toc203572626" w:history="1">
+          <w:hyperlink w:anchor="_Toc205138890" w:history="1">
             <w:r>
               <w:rPr>
                 <w:rStyle w:val="Hyperlink"/>
@@ -6726,6 +6832,178 @@
                 <w:noProof/>
                 <w:highlight w:val="yellow"/>
               </w:rPr>
+              <w:t>Comparação</w:t>
+            </w:r>
+            <w:r>
+              <w:rPr>
+                <w:noProof/>
+                <w:webHidden/>
+              </w:rPr>
+              <w:tab/>
+            </w:r>
+            <w:r>
+              <w:rPr>
+                <w:noProof/>
+                <w:webHidden/>
+              </w:rPr>
+              <w:fldChar w:fldCharType="begin"/>
+            </w:r>
+            <w:r>
+              <w:rPr>
+                <w:noProof/>
+                <w:webHidden/>
+              </w:rPr>
+              <w:instrText xml:space="preserve"> PAGEREF _Toc205138890 \h </w:instrText>
+            </w:r>
+            <w:r>
+              <w:rPr>
+                <w:noProof/>
+                <w:webHidden/>
+              </w:rPr>
+            </w:r>
+            <w:r>
+              <w:rPr>
+                <w:noProof/>
+                <w:webHidden/>
+              </w:rPr>
+              <w:fldChar w:fldCharType="separate"/>
+            </w:r>
+            <w:r>
+              <w:rPr>
+                <w:noProof/>
+                <w:webHidden/>
+              </w:rPr>
+              <w:t>18</w:t>
+            </w:r>
+            <w:r>
+              <w:rPr>
+                <w:noProof/>
+                <w:webHidden/>
+              </w:rPr>
+              <w:fldChar w:fldCharType="end"/>
+            </w:r>
+          </w:hyperlink>
+        </w:p>
+        <w:p>
+          <w:pPr>
+            <w:pStyle w:val="Sumrio3"/>
+            <w:rPr>
+              <w:rFonts w:asciiTheme="minorHAnsi" w:eastAsiaTheme="minorEastAsia" w:hAnsiTheme="minorHAnsi"/>
+              <w:noProof/>
+              <w:sz w:val="22"/>
+              <w:lang w:eastAsia="pt-BR"/>
+            </w:rPr>
+          </w:pPr>
+          <w:hyperlink w:anchor="_Toc205138891" w:history="1">
+            <w:r>
+              <w:rPr>
+                <w:rStyle w:val="Hyperlink"/>
+                <w:noProof/>
+                <w:highlight w:val="yellow"/>
+              </w:rPr>
+              <w:t>4.2.1</w:t>
+            </w:r>
+            <w:r>
+              <w:rPr>
+                <w:rFonts w:asciiTheme="minorHAnsi" w:eastAsiaTheme="minorEastAsia" w:hAnsiTheme="minorHAnsi"/>
+                <w:noProof/>
+                <w:sz w:val="22"/>
+                <w:lang w:eastAsia="pt-BR"/>
+              </w:rPr>
+              <w:tab/>
+            </w:r>
+            <w:r>
+              <w:rPr>
+                <w:rStyle w:val="Hyperlink"/>
+                <w:noProof/>
+                <w:highlight w:val="yellow"/>
+              </w:rPr>
+              <w:t>Comparação dos modelos</w:t>
+            </w:r>
+            <w:r>
+              <w:rPr>
+                <w:noProof/>
+                <w:webHidden/>
+              </w:rPr>
+              <w:tab/>
+            </w:r>
+            <w:r>
+              <w:rPr>
+                <w:noProof/>
+                <w:webHidden/>
+              </w:rPr>
+              <w:fldChar w:fldCharType="begin"/>
+            </w:r>
+            <w:r>
+              <w:rPr>
+                <w:noProof/>
+                <w:webHidden/>
+              </w:rPr>
+              <w:instrText xml:space="preserve"> PAGEREF _Toc205138891 \h </w:instrText>
+            </w:r>
+            <w:r>
+              <w:rPr>
+                <w:noProof/>
+                <w:webHidden/>
+              </w:rPr>
+            </w:r>
+            <w:r>
+              <w:rPr>
+                <w:noProof/>
+                <w:webHidden/>
+              </w:rPr>
+              <w:fldChar w:fldCharType="separate"/>
+            </w:r>
+            <w:r>
+              <w:rPr>
+                <w:noProof/>
+                <w:webHidden/>
+              </w:rPr>
+              <w:t>18</w:t>
+            </w:r>
+            <w:r>
+              <w:rPr>
+                <w:noProof/>
+                <w:webHidden/>
+              </w:rPr>
+              <w:fldChar w:fldCharType="end"/>
+            </w:r>
+          </w:hyperlink>
+        </w:p>
+        <w:p>
+          <w:pPr>
+            <w:pStyle w:val="Sumrio3"/>
+            <w:rPr>
+              <w:rFonts w:asciiTheme="minorHAnsi" w:eastAsiaTheme="minorEastAsia" w:hAnsiTheme="minorHAnsi"/>
+              <w:noProof/>
+              <w:sz w:val="22"/>
+              <w:lang w:eastAsia="pt-BR"/>
+            </w:rPr>
+          </w:pPr>
+          <w:hyperlink w:anchor="_Toc205138892" w:history="1">
+            <w:r>
+              <w:rPr>
+                <w:rStyle w:val="Hyperlink"/>
+                <w:noProof/>
+                <w:highlight w:val="yellow"/>
+              </w:rPr>
+              <w:t>4.2.2</w:t>
+            </w:r>
+            <w:r>
+              <w:rPr>
+                <w:rFonts w:asciiTheme="minorHAnsi" w:eastAsiaTheme="minorEastAsia" w:hAnsiTheme="minorHAnsi"/>
+                <w:noProof/>
+                <w:sz w:val="22"/>
+                <w:lang w:eastAsia="pt-BR"/>
+              </w:rPr>
+              <w:tab/>
+            </w:r>
+            <w:r>
+              <w:rPr>
+                <w:rStyle w:val="Hyperlink"/>
+                <w:noProof/>
+                <w:highlight w:val="yellow"/>
+              </w:rPr>
               <w:t>Comparação de Tempo de Execução</w:t>
             </w:r>
             <w:r>
@@ -6747,7 +7025,7 @@
                 <w:noProof/>
                 <w:webHidden/>
               </w:rPr>
-              <w:instrText xml:space="preserve"> PAGEREF _Toc203572626 \h </w:instrText>
+              <w:instrText xml:space="preserve"> PAGEREF _Toc205138892 \h </w:instrText>
             </w:r>
             <w:r>
               <w:rPr>
@@ -6788,7 +7066,7 @@
               <w:lang w:eastAsia="pt-BR"/>
             </w:rPr>
           </w:pPr>
-          <w:hyperlink w:anchor="_Toc203572627" w:history="1">
+          <w:hyperlink w:anchor="_Toc205138893" w:history="1">
             <w:r>
               <w:rPr>
                 <w:rStyle w:val="Hyperlink"/>
@@ -6833,7 +7111,7 @@
                 <w:noProof/>
                 <w:webHidden/>
               </w:rPr>
-              <w:instrText xml:space="preserve"> PAGEREF _Toc203572627 \h </w:instrText>
+              <w:instrText xml:space="preserve"> PAGEREF _Toc205138893 \h </w:instrText>
             </w:r>
             <w:r>
               <w:rPr>
@@ -6874,7 +7152,7 @@
               <w:lang w:eastAsia="pt-BR"/>
             </w:rPr>
           </w:pPr>
-          <w:hyperlink w:anchor="_Toc203572628" w:history="1">
+          <w:hyperlink w:anchor="_Toc205138894" w:history="1">
             <w:r>
               <w:rPr>
                 <w:rStyle w:val="Hyperlink"/>
@@ -6919,7 +7197,7 @@
                 <w:noProof/>
                 <w:webHidden/>
               </w:rPr>
-              <w:instrText xml:space="preserve"> PAGEREF _Toc203572628 \h </w:instrText>
+              <w:instrText xml:space="preserve"> PAGEREF _Toc205138894 \h </w:instrText>
             </w:r>
             <w:r>
               <w:rPr>
@@ -6960,7 +7238,7 @@
               <w:lang w:eastAsia="pt-BR"/>
             </w:rPr>
           </w:pPr>
-          <w:hyperlink w:anchor="_Toc203572629" w:history="1">
+          <w:hyperlink w:anchor="_Toc205138895" w:history="1">
             <w:r>
               <w:rPr>
                 <w:rStyle w:val="Hyperlink"/>
@@ -7005,7 +7283,7 @@
                 <w:noProof/>
                 <w:webHidden/>
               </w:rPr>
-              <w:instrText xml:space="preserve"> PAGEREF _Toc203572629 \h </w:instrText>
+              <w:instrText xml:space="preserve"> PAGEREF _Toc205138895 \h </w:instrText>
             </w:r>
             <w:r>
               <w:rPr>
@@ -7046,7 +7324,7 @@
               <w:lang w:eastAsia="pt-BR"/>
             </w:rPr>
           </w:pPr>
-          <w:hyperlink w:anchor="_Toc203572630" w:history="1">
+          <w:hyperlink w:anchor="_Toc205138896" w:history="1">
             <w:r>
               <w:rPr>
                 <w:rStyle w:val="Hyperlink"/>
@@ -7089,7 +7367,7 @@
                 <w:noProof/>
                 <w:webHidden/>
               </w:rPr>
-              <w:instrText xml:space="preserve"> PAGEREF _Toc203572630 \h </w:instrText>
+              <w:instrText xml:space="preserve"> PAGEREF _Toc205138896 \h </w:instrText>
             </w:r>
             <w:r>
               <w:rPr>
@@ -7147,7 +7425,7 @@
         </w:rPr>
       </w:pPr>
       <w:bookmarkStart w:id="1" w:name="_Toc471561137"/>
-      <w:bookmarkStart w:id="2" w:name="_Toc203572592"/>
+      <w:bookmarkStart w:id="2" w:name="_Toc205138854"/>
       <w:r>
         <w:rPr>
           <w:lang w:val="en-US"/>
@@ -7573,7 +7851,7 @@
       <w:pPr>
         <w:pStyle w:val="Ttulo2"/>
       </w:pPr>
-      <w:bookmarkStart w:id="4" w:name="_Toc203572593"/>
+      <w:bookmarkStart w:id="4" w:name="_Toc205138855"/>
       <w:proofErr w:type="spellStart"/>
       <w:r>
         <w:t>Problema</w:t>
@@ -7632,7 +7910,7 @@
       <w:pPr>
         <w:pStyle w:val="Ttulo2"/>
       </w:pPr>
-      <w:bookmarkStart w:id="5" w:name="_Toc203572594"/>
+      <w:bookmarkStart w:id="5" w:name="_Toc205138856"/>
       <w:r>
         <w:rPr>
           <w:lang w:val="pt-BR"/>
@@ -7645,7 +7923,7 @@
       <w:pPr>
         <w:pStyle w:val="Ttulo3"/>
       </w:pPr>
-      <w:bookmarkStart w:id="6" w:name="_Toc203572595"/>
+      <w:bookmarkStart w:id="6" w:name="_Toc205138857"/>
       <w:r>
         <w:rPr>
           <w:lang w:val="pt-BR"/>
@@ -7697,7 +7975,7 @@
       <w:pPr>
         <w:pStyle w:val="Ttulo3"/>
       </w:pPr>
-      <w:bookmarkStart w:id="7" w:name="_Toc203572596"/>
+      <w:bookmarkStart w:id="7" w:name="_Toc205138858"/>
       <w:r>
         <w:rPr>
           <w:lang w:val="pt-BR"/>
@@ -7934,7 +8212,7 @@
       <w:pPr>
         <w:pStyle w:val="Ttulo2"/>
       </w:pPr>
-      <w:bookmarkStart w:id="8" w:name="_Toc203572597"/>
+      <w:bookmarkStart w:id="8" w:name="_Toc205138859"/>
       <w:proofErr w:type="spellStart"/>
       <w:r>
         <w:t>Organização</w:t>
@@ -7960,9 +8238,8 @@
           <w:highlight w:val="lightGray"/>
           <w:lang w:eastAsia="pt-BR"/>
         </w:rPr>
-        <w:t xml:space="preserve">Este Trabalho de Conclusão de Curso está estruturado em sete capítulos. O Capítulo 1, Introdução, apresenta o contexto da pesquisa, destacando a importância do uso de técnicas de ciência de dados na área da saúde, especialmente no enfrentamento da Síndrome Respiratória Aguda Grave (SRAG). Também define o problema de pesquisa, os </w:t>
-      </w:r>
-      <w:proofErr w:type="gramStart"/>
+        <w:t xml:space="preserve">Este Trabalho de Conclusão de Curso está estruturado em sete capítulos. O Capítulo 1, Introdução, apresenta o contexto da pesquisa, destacando a importância do uso de técnicas de ciência de dados na área da saúde, especialmente no enfrentamento da Síndrome Respiratória Aguda Grave (SRAG). Também define o problema de pesquisa, os objetivos geral e específicos, e a justificativa do estudo. O Capítulo 2, Revisão Bibliográfica, aborda os fundamentos teóricos relacionados à SRAG, ao processo de descoberta de conhecimento em bases de dados (KDD), às etapas de pré-processamento, às técnicas de análise de dados e aos principais algoritmos de aprendizado de máquina aplicados à predição de desfechos clínicos. O Capítulo 3, Metodologia, descreve os dados utilizados, o processo de pré-processamento, as ferramentas adotadas para a </w:t>
+      </w:r>
       <w:r>
         <w:rPr>
           <w:rFonts w:eastAsia="Times New Roman" w:cs="Times New Roman"/>
@@ -7970,9 +8247,10 @@
           <w:highlight w:val="lightGray"/>
           <w:lang w:eastAsia="pt-BR"/>
         </w:rPr>
-        <w:t>objetivos geral</w:t>
-      </w:r>
-      <w:proofErr w:type="gramEnd"/>
+        <w:lastRenderedPageBreak/>
+        <w:t>análise e implementação dos modelos, os ambientes computacionais utilizados para a execução dos algoritmos e os critérios adotados para avaliação de desempenho preditivo e computacional. O Capítulo 4, Resultados, apresenta os resultados obtidos na aplicação do algoritmo desenvolvido (</w:t>
+      </w:r>
+      <w:proofErr w:type="spellStart"/>
       <w:r>
         <w:rPr>
           <w:rFonts w:eastAsia="Times New Roman" w:cs="Times New Roman"/>
@@ -7980,8 +8258,9 @@
           <w:highlight w:val="lightGray"/>
           <w:lang w:eastAsia="pt-BR"/>
         </w:rPr>
-        <w:t xml:space="preserve"> e específicos, e a justificativa do estudo. O Capítulo 2, Revisão Bibliográfica, aborda os fundamentos teóricos relacionados à SRAG, ao processo de descoberta de conhecimento em bases de dados (KDD), às etapas de pré-processamento, às técnicas de análise de dados e aos principais algoritmos de aprendizado de máquina aplicados à predição de desfechos clínicos. O Capítulo 3, Metodologia, descreve os dados utilizados, o processo de pré-processamento, as ferramentas adotadas para a </w:t>
-      </w:r>
+        <w:t>real_collab</w:t>
+      </w:r>
+      <w:proofErr w:type="spellEnd"/>
       <w:r>
         <w:rPr>
           <w:rFonts w:eastAsia="Times New Roman" w:cs="Times New Roman"/>
@@ -7989,8 +8268,7 @@
           <w:highlight w:val="lightGray"/>
           <w:lang w:eastAsia="pt-BR"/>
         </w:rPr>
-        <w:lastRenderedPageBreak/>
-        <w:t>análise e implementação dos modelos, os ambientes computacionais utilizados para a execução dos algoritmos e os critérios adotados para avaliação de desempenho preditivo e computacional. O Capítulo 4, Resultados, apresenta os resultados obtidos na aplicação do algoritmo desenvolvido (</w:t>
+        <w:t xml:space="preserve">) em diferentes ambientes computacionais, bem como a comparação entre os modelos de aprendizado de máquina CART e </w:t>
       </w:r>
       <w:proofErr w:type="spellStart"/>
       <w:r>
@@ -8000,7 +8278,7 @@
           <w:highlight w:val="lightGray"/>
           <w:lang w:eastAsia="pt-BR"/>
         </w:rPr>
-        <w:t>real_collab</w:t>
+        <w:t>Random</w:t>
       </w:r>
       <w:proofErr w:type="spellEnd"/>
       <w:r>
@@ -8010,26 +8288,6 @@
           <w:highlight w:val="lightGray"/>
           <w:lang w:eastAsia="pt-BR"/>
         </w:rPr>
-        <w:t xml:space="preserve">) em diferentes ambientes computacionais, bem como a comparação entre os modelos de aprendizado de máquina CART e </w:t>
-      </w:r>
-      <w:proofErr w:type="spellStart"/>
-      <w:r>
-        <w:rPr>
-          <w:rFonts w:eastAsia="Times New Roman" w:cs="Times New Roman"/>
-          <w:szCs w:val="24"/>
-          <w:highlight w:val="lightGray"/>
-          <w:lang w:eastAsia="pt-BR"/>
-        </w:rPr>
-        <w:t>Random</w:t>
-      </w:r>
-      <w:proofErr w:type="spellEnd"/>
-      <w:r>
-        <w:rPr>
-          <w:rFonts w:eastAsia="Times New Roman" w:cs="Times New Roman"/>
-          <w:szCs w:val="24"/>
-          <w:highlight w:val="lightGray"/>
-          <w:lang w:eastAsia="pt-BR"/>
-        </w:rPr>
         <w:t xml:space="preserve"> Forest, com base nas métricas de avaliação preditiva e no tempo de execução. O Capítulo 5, Discussão, analisa os resultados obtidos, destacando os principais achados, interpretando as diferenças de desempenho entre os algoritmos e discutindo as variáveis mais relevantes para a predição dos desfechos clínicos. O Capítulo 6, Conclusão, resume os principais resultados do estudo, responde ao problema de pesquisa, apresenta as limitações encontradas e propõe sugestões para trabalhos futuros. Por fim, o Capítulo 7, Referências Bibliográficas, apresenta todas as fontes utilizadas para fundamentar teoricamente o trabalho, conforme as normas da ABNT.</w:t>
       </w:r>
     </w:p>
@@ -8046,7 +8304,7 @@
       <w:pPr>
         <w:pStyle w:val="Ttulo1"/>
       </w:pPr>
-      <w:bookmarkStart w:id="9" w:name="_Toc203572598"/>
+      <w:bookmarkStart w:id="9" w:name="_Toc205138860"/>
       <w:r>
         <w:lastRenderedPageBreak/>
         <w:t>REVISÃO BIBLIOGRÁFICA</w:t>
@@ -8061,8 +8319,8 @@
         </w:rPr>
       </w:pPr>
       <w:bookmarkStart w:id="10" w:name="_Toc203431569"/>
-      <w:bookmarkStart w:id="11" w:name="_Toc203572599"/>
-      <w:bookmarkStart w:id="12" w:name="_Toc16233499"/>
+      <w:bookmarkStart w:id="11" w:name="_Toc16233499"/>
+      <w:bookmarkStart w:id="12" w:name="_Toc205138861"/>
       <w:r>
         <w:rPr>
           <w:lang w:val="pt-BR"/>
@@ -8098,7 +8356,7 @@
         <w:t xml:space="preserve"> Aguda Grave)</w:t>
       </w:r>
       <w:bookmarkEnd w:id="10"/>
-      <w:bookmarkEnd w:id="11"/>
+      <w:bookmarkEnd w:id="12"/>
     </w:p>
     <w:p>
       <w:pPr>
@@ -8210,7 +8468,7 @@
       <w:pPr>
         <w:pStyle w:val="Ttulo2"/>
       </w:pPr>
-      <w:bookmarkStart w:id="13" w:name="_Toc203572600"/>
+      <w:bookmarkStart w:id="13" w:name="_Toc205138862"/>
       <w:r>
         <w:t>Dados</w:t>
       </w:r>
@@ -8220,7 +8478,7 @@
       <w:pPr>
         <w:pStyle w:val="Ttulo3"/>
       </w:pPr>
-      <w:bookmarkStart w:id="14" w:name="_Toc203572601"/>
+      <w:bookmarkStart w:id="14" w:name="_Toc205138863"/>
       <w:r>
         <w:t>KDD</w:t>
       </w:r>
@@ -8436,14 +8694,27 @@
       <w:r>
         <w:t xml:space="preserve">Figura </w:t>
       </w:r>
-      <w:fldSimple w:instr=" SEQ Figura \* ARABIC ">
-        <w:r>
-          <w:rPr>
-            <w:noProof/>
-          </w:rPr>
-          <w:t>1</w:t>
-        </w:r>
-      </w:fldSimple>
+      <w:r>
+        <w:fldChar w:fldCharType="begin"/>
+      </w:r>
+      <w:r>
+        <w:instrText xml:space="preserve"> SEQ Figura \* ARABIC </w:instrText>
+      </w:r>
+      <w:r>
+        <w:fldChar w:fldCharType="separate"/>
+      </w:r>
+      <w:r>
+        <w:rPr>
+          <w:noProof/>
+        </w:rPr>
+        <w:t>1</w:t>
+      </w:r>
+      <w:r>
+        <w:rPr>
+          <w:noProof/>
+        </w:rPr>
+        <w:fldChar w:fldCharType="end"/>
+      </w:r>
       <w:r>
         <w:t xml:space="preserve"> – As etapas do processo de KDD</w:t>
       </w:r>
@@ -8529,7 +8800,7 @@
       <w:pPr>
         <w:pStyle w:val="Ttulo3"/>
       </w:pPr>
-      <w:bookmarkStart w:id="15" w:name="_Toc203572602"/>
+      <w:bookmarkStart w:id="15" w:name="_Toc205138864"/>
       <w:r>
         <w:t xml:space="preserve">Dados </w:t>
       </w:r>
@@ -8585,7 +8856,7 @@
           <w:lang w:val="pt-BR"/>
         </w:rPr>
       </w:pPr>
-      <w:bookmarkStart w:id="16" w:name="_Toc203572603"/>
+      <w:bookmarkStart w:id="16" w:name="_Toc205138865"/>
       <w:commentRangeStart w:id="17"/>
       <w:r>
         <w:rPr>
@@ -8622,15 +8893,7 @@
         <w:ind w:firstLine="0"/>
       </w:pPr>
       <w:r>
-        <w:t>Através da Secretaria de Vigilância em Saúde (SVS), o Ministério da Saúde (MS) faz a vigilância da SRAG no Brasil desde a pandemia de Influenza A(H1N</w:t>
-      </w:r>
-      <w:proofErr w:type="gramStart"/>
-      <w:r>
-        <w:t>1)pdm</w:t>
-      </w:r>
-      <w:proofErr w:type="gramEnd"/>
-      <w:r>
-        <w:t>09. A partir disso, a vigilância de SRAG foi incorporada à rede de vigilância de Influenza e outros vírus respiratórios, que anteriormente atuava exclusivamente com a vigilância sentinela de Síndrome Gripal (SG) (MINISTÉRIO DA SAÚDE, 2025).</w:t>
+        <w:t>Através da Secretaria de Vigilância em Saúde (SVS), o Ministério da Saúde (MS) faz a vigilância da SRAG no Brasil desde a pandemia de Influenza A(H1N1)pdm09. A partir disso, a vigilância de SRAG foi incorporada à rede de vigilância de Influenza e outros vírus respiratórios, que anteriormente atuava exclusivamente com a vigilância sentinela de Síndrome Gripal (SG) (MINISTÉRIO DA SAÚDE, 2025).</w:t>
       </w:r>
     </w:p>
     <w:p>
@@ -8668,7 +8931,7 @@
       <w:pPr>
         <w:pStyle w:val="Ttulo2"/>
       </w:pPr>
-      <w:bookmarkStart w:id="18" w:name="_Toc203572604"/>
+      <w:bookmarkStart w:id="18" w:name="_Toc205138866"/>
       <w:commentRangeStart w:id="19"/>
       <w:commentRangeStart w:id="20"/>
       <w:proofErr w:type="spellStart"/>
@@ -8984,27 +9247,14 @@
             <w:r>
               <w:t>(</w:t>
             </w:r>
-            <w:r>
-              <w:fldChar w:fldCharType="begin"/>
-            </w:r>
-            <w:r>
-              <w:instrText xml:space="preserve"> SEQ Eqn \* MERGEFORMAT </w:instrText>
-            </w:r>
-            <w:r>
-              <w:fldChar w:fldCharType="separate"/>
-            </w:r>
-            <w:r>
-              <w:rPr>
-                <w:noProof/>
-              </w:rPr>
-              <w:t>1</w:t>
-            </w:r>
-            <w:r>
-              <w:rPr>
-                <w:noProof/>
-              </w:rPr>
-              <w:fldChar w:fldCharType="end"/>
-            </w:r>
+            <w:fldSimple w:instr=" SEQ Eqn \* MERGEFORMAT ">
+              <w:r>
+                <w:rPr>
+                  <w:noProof/>
+                </w:rPr>
+                <w:t>1</w:t>
+              </w:r>
+            </w:fldSimple>
             <w:r>
               <w:t>)</w:t>
             </w:r>
@@ -9177,7 +9427,7 @@
       <w:pPr>
         <w:pStyle w:val="Ttulo2"/>
       </w:pPr>
-      <w:bookmarkStart w:id="21" w:name="_Toc203572605"/>
+      <w:bookmarkStart w:id="21" w:name="_Toc205138867"/>
       <w:r>
         <w:lastRenderedPageBreak/>
         <w:t>Analise de Dados</w:t>
@@ -9257,7 +9507,7 @@
       <w:pPr>
         <w:pStyle w:val="Ttulo2"/>
       </w:pPr>
-      <w:bookmarkStart w:id="22" w:name="_Toc203572606"/>
+      <w:bookmarkStart w:id="22" w:name="_Toc205138868"/>
       <w:proofErr w:type="spellStart"/>
       <w:r>
         <w:t>Técnicas</w:t>
@@ -9301,7 +9551,7 @@
         <w:pStyle w:val="Ttulo2"/>
       </w:pPr>
       <w:bookmarkStart w:id="23" w:name="_Toc203431570"/>
-      <w:bookmarkStart w:id="24" w:name="_Toc203572607"/>
+      <w:bookmarkStart w:id="24" w:name="_Toc205138869"/>
       <w:r>
         <w:t>Algoritmos</w:t>
       </w:r>
@@ -9345,7 +9595,7 @@
       </w:pPr>
       <w:bookmarkStart w:id="25" w:name="_Toc193304963"/>
       <w:bookmarkStart w:id="26" w:name="_Toc203431571"/>
-      <w:bookmarkStart w:id="27" w:name="_Toc203572608"/>
+      <w:bookmarkStart w:id="27" w:name="_Toc205138870"/>
       <w:proofErr w:type="spellStart"/>
       <w:r>
         <w:t>A</w:t>
@@ -9511,27 +9761,14 @@
             <w:r>
               <w:t>(</w:t>
             </w:r>
-            <w:r>
-              <w:fldChar w:fldCharType="begin"/>
-            </w:r>
-            <w:r>
-              <w:instrText xml:space="preserve"> SEQ Eqn \* MERGEFORMAT </w:instrText>
-            </w:r>
-            <w:r>
-              <w:fldChar w:fldCharType="separate"/>
-            </w:r>
-            <w:r>
-              <w:rPr>
-                <w:noProof/>
-              </w:rPr>
-              <w:t>2</w:t>
-            </w:r>
-            <w:r>
-              <w:rPr>
-                <w:noProof/>
-              </w:rPr>
-              <w:fldChar w:fldCharType="end"/>
-            </w:r>
+            <w:fldSimple w:instr=" SEQ Eqn \* MERGEFORMAT ">
+              <w:r>
+                <w:rPr>
+                  <w:noProof/>
+                </w:rPr>
+                <w:t>2</w:t>
+              </w:r>
+            </w:fldSimple>
             <w:r>
               <w:t>)</w:t>
             </w:r>
@@ -9911,27 +10148,14 @@
             <w:r>
               <w:t>(</w:t>
             </w:r>
-            <w:r>
-              <w:fldChar w:fldCharType="begin"/>
-            </w:r>
-            <w:r>
-              <w:instrText xml:space="preserve"> SEQ Eqn \* MERGEFORMAT </w:instrText>
-            </w:r>
-            <w:r>
-              <w:fldChar w:fldCharType="separate"/>
-            </w:r>
-            <w:r>
-              <w:rPr>
-                <w:noProof/>
-              </w:rPr>
-              <w:t>3</w:t>
-            </w:r>
-            <w:r>
-              <w:rPr>
-                <w:noProof/>
-              </w:rPr>
-              <w:fldChar w:fldCharType="end"/>
-            </w:r>
+            <w:fldSimple w:instr=" SEQ Eqn \* MERGEFORMAT ">
+              <w:r>
+                <w:rPr>
+                  <w:noProof/>
+                </w:rPr>
+                <w:t>3</w:t>
+              </w:r>
+            </w:fldSimple>
             <w:r>
               <w:t>)</w:t>
             </w:r>
@@ -10101,7 +10325,7 @@
       </w:pPr>
       <w:bookmarkStart w:id="31" w:name="_Toc193304964"/>
       <w:bookmarkStart w:id="32" w:name="_Toc203431574"/>
-      <w:bookmarkStart w:id="33" w:name="_Toc203572609"/>
+      <w:bookmarkStart w:id="33" w:name="_Toc205138871"/>
       <w:r>
         <w:t>M</w:t>
       </w:r>
@@ -10194,23 +10418,7 @@
           <w:b w:val="0"/>
           <w:lang w:val="pt-BR"/>
         </w:rPr>
-        <w:t xml:space="preserve"> é um algoritmo utilizado para encontrar padrões frequentes em bases de dados transacionais, alguns casos de uso comuns são sistemas de previsão e recomendação de doenças, como análise de cestas de mercado para plataformas de comércio eletrônico (</w:t>
-      </w:r>
-      <w:proofErr w:type="gramStart"/>
-      <w:r>
-        <w:rPr>
-          <w:b w:val="0"/>
-          <w:lang w:val="pt-BR"/>
-        </w:rPr>
-        <w:t>IBM,  2024</w:t>
-      </w:r>
-      <w:proofErr w:type="gramEnd"/>
-      <w:r>
-        <w:rPr>
-          <w:b w:val="0"/>
-          <w:lang w:val="pt-BR"/>
-        </w:rPr>
-        <w:t>).</w:t>
+        <w:t xml:space="preserve"> é um algoritmo utilizado para encontrar padrões frequentes em bases de dados transacionais, alguns casos de uso comuns são sistemas de previsão e recomendação de doenças, como análise de cestas de mercado para plataformas de comércio eletrônico (IBM,  2024).</w:t>
       </w:r>
       <w:bookmarkEnd w:id="35"/>
     </w:p>
@@ -10312,7 +10520,7 @@
       </w:pPr>
       <w:bookmarkStart w:id="37" w:name="_Toc193304965"/>
       <w:bookmarkStart w:id="38" w:name="_Toc203431578"/>
-      <w:bookmarkStart w:id="39" w:name="_Toc203572610"/>
+      <w:bookmarkStart w:id="39" w:name="_Toc205138872"/>
       <w:proofErr w:type="spellStart"/>
       <w:r>
         <w:t>A</w:t>
@@ -10916,7 +11124,7 @@
       </w:pPr>
       <w:bookmarkStart w:id="47" w:name="_Toc193304966"/>
       <w:bookmarkStart w:id="48" w:name="_Toc203431583"/>
-      <w:bookmarkStart w:id="49" w:name="_Toc203572611"/>
+      <w:bookmarkStart w:id="49" w:name="_Toc205138873"/>
       <w:r>
         <w:t>R</w:t>
       </w:r>
@@ -11283,7 +11491,7 @@
           <w:highlight w:val="yellow"/>
         </w:rPr>
       </w:pPr>
-      <w:bookmarkStart w:id="55" w:name="_Toc203572612"/>
+      <w:bookmarkStart w:id="55" w:name="_Toc205138874"/>
       <w:proofErr w:type="spellStart"/>
       <w:r>
         <w:rPr>
@@ -11316,7 +11524,7 @@
           <w:lang w:val="pt-BR"/>
         </w:rPr>
       </w:pPr>
-      <w:bookmarkStart w:id="56" w:name="_Toc203572613"/>
+      <w:bookmarkStart w:id="56" w:name="_Toc205138875"/>
       <w:r>
         <w:rPr>
           <w:lang w:val="pt-BR"/>
@@ -11380,15 +11588,7 @@
         <w:t xml:space="preserve">) </w:t>
       </w:r>
       <w:r>
-        <w:t xml:space="preserve">é um algoritmo de aprendizado de máquina e ao mesmo tempo uma técnica de mineração de dados, utilizada para prever, classificar e extrair conhecimento a partir de dados foi criada esta seção para detalhar sua aplicação e importância. Pode-se dizer que as Árvores de Decisão são modelos hierárquicos que segmentam os dados com base em condições lógicas sucessivas. Elas são </w:t>
-      </w:r>
-      <w:proofErr w:type="gramStart"/>
-      <w:r>
-        <w:t>eficientes e interpretáveis</w:t>
-      </w:r>
-      <w:proofErr w:type="gramEnd"/>
-      <w:r>
-        <w:t xml:space="preserve"> para tarefas de classificação e regressão, sendo frequentemente utilizadas em conjunto com outros métodos para aumentar a robustez dos modelos (Silva e Silva Neto, 2022).</w:t>
+        <w:t>é um algoritmo de aprendizado de máquina e ao mesmo tempo uma técnica de mineração de dados, utilizada para prever, classificar e extrair conhecimento a partir de dados foi criada esta seção para detalhar sua aplicação e importância. Pode-se dizer que as Árvores de Decisão são modelos hierárquicos que segmentam os dados com base em condições lógicas sucessivas. Elas são eficientes e interpretáveis para tarefas de classificação e regressão, sendo frequentemente utilizadas em conjunto com outros métodos para aumentar a robustez dos modelos (Silva e Silva Neto, 2022).</w:t>
       </w:r>
     </w:p>
     <w:p>
@@ -11408,7 +11608,6 @@
           <w:lang w:eastAsia="pt-BR"/>
         </w:rPr>
       </w:pPr>
-      <w:proofErr w:type="gramStart"/>
       <w:r>
         <w:rPr>
           <w:rFonts w:eastAsia="Times New Roman" w:hAnsi="Symbol" w:cs="Times New Roman"/>
@@ -11425,17 +11624,37 @@
           <w:highlight w:val="lightGray"/>
           <w:lang w:eastAsia="pt-BR"/>
         </w:rPr>
-        <w:t xml:space="preserve">  Como</w:t>
-      </w:r>
-      <w:proofErr w:type="gramEnd"/>
-      <w:r>
+        <w:t xml:space="preserve">  Como a árvore divide os dados (por Gini ou entropia, por exemplo).</w:t>
+      </w:r>
+    </w:p>
+    <w:p>
+      <w:pPr>
+        <w:spacing w:before="100" w:beforeAutospacing="1" w:after="100" w:afterAutospacing="1" w:line="240" w:lineRule="auto"/>
+        <w:jc w:val="left"/>
         <w:rPr>
           <w:rFonts w:eastAsia="Times New Roman" w:cs="Times New Roman"/>
           <w:szCs w:val="24"/>
           <w:highlight w:val="lightGray"/>
           <w:lang w:eastAsia="pt-BR"/>
         </w:rPr>
-        <w:t xml:space="preserve"> a árvore divide os dados (por Gini ou entropia, por exemplo).</w:t>
+      </w:pPr>
+      <w:r>
+        <w:rPr>
+          <w:rFonts w:eastAsia="Times New Roman" w:hAnsi="Symbol" w:cs="Times New Roman"/>
+          <w:szCs w:val="24"/>
+          <w:highlight w:val="lightGray"/>
+          <w:lang w:eastAsia="pt-BR"/>
+        </w:rPr>
+        <w:t></w:t>
+      </w:r>
+      <w:r>
+        <w:rPr>
+          <w:rFonts w:eastAsia="Times New Roman" w:cs="Times New Roman"/>
+          <w:szCs w:val="24"/>
+          <w:highlight w:val="lightGray"/>
+          <w:lang w:eastAsia="pt-BR"/>
+        </w:rPr>
+        <w:t xml:space="preserve">  A ideia de "nós", "ramos", "folhas", e decisões hierárquicas.</w:t>
       </w:r>
     </w:p>
     <w:p>
@@ -11445,20 +11664,29 @@
         <w:rPr>
           <w:rFonts w:eastAsia="Times New Roman" w:cs="Times New Roman"/>
           <w:szCs w:val="24"/>
+          <w:lang w:eastAsia="pt-BR"/>
+        </w:rPr>
+      </w:pPr>
+      <w:r>
+        <w:rPr>
+          <w:rFonts w:eastAsia="Times New Roman" w:hAnsi="Symbol" w:cs="Times New Roman"/>
+          <w:szCs w:val="24"/>
           <w:highlight w:val="lightGray"/>
           <w:lang w:eastAsia="pt-BR"/>
         </w:rPr>
-      </w:pPr>
-      <w:proofErr w:type="gramStart"/>
-      <w:r>
-        <w:rPr>
-          <w:rFonts w:eastAsia="Times New Roman" w:hAnsi="Symbol" w:cs="Times New Roman"/>
+        <w:lastRenderedPageBreak/>
+        <w:t></w:t>
+      </w:r>
+      <w:r>
+        <w:rPr>
+          <w:rFonts w:eastAsia="Times New Roman" w:cs="Times New Roman"/>
           <w:szCs w:val="24"/>
           <w:highlight w:val="lightGray"/>
           <w:lang w:eastAsia="pt-BR"/>
         </w:rPr>
-        <w:t></w:t>
-      </w:r>
+        <w:t xml:space="preserve">  Vantagens (</w:t>
+      </w:r>
+      <w:proofErr w:type="spellStart"/>
       <w:r>
         <w:rPr>
           <w:rFonts w:eastAsia="Times New Roman" w:cs="Times New Roman"/>
@@ -11466,9 +11694,9 @@
           <w:highlight w:val="lightGray"/>
           <w:lang w:eastAsia="pt-BR"/>
         </w:rPr>
-        <w:t xml:space="preserve">  A</w:t>
-      </w:r>
-      <w:proofErr w:type="gramEnd"/>
+        <w:t>interpretabilidade</w:t>
+      </w:r>
+      <w:proofErr w:type="spellEnd"/>
       <w:r>
         <w:rPr>
           <w:rFonts w:eastAsia="Times New Roman" w:cs="Times New Roman"/>
@@ -11476,7 +11704,83 @@
           <w:highlight w:val="lightGray"/>
           <w:lang w:eastAsia="pt-BR"/>
         </w:rPr>
-        <w:t xml:space="preserve"> ideia de "nós", "ramos", "folhas", e decisões hierárquicas.</w:t>
+        <w:t>, rapidez) e desvantagens (</w:t>
+      </w:r>
+      <w:proofErr w:type="spellStart"/>
+      <w:r>
+        <w:rPr>
+          <w:rFonts w:eastAsia="Times New Roman" w:cs="Times New Roman"/>
+          <w:szCs w:val="24"/>
+          <w:highlight w:val="lightGray"/>
+          <w:lang w:eastAsia="pt-BR"/>
+        </w:rPr>
+        <w:t>overfitting</w:t>
+      </w:r>
+      <w:proofErr w:type="spellEnd"/>
+      <w:r>
+        <w:rPr>
+          <w:rFonts w:eastAsia="Times New Roman" w:cs="Times New Roman"/>
+          <w:szCs w:val="24"/>
+          <w:highlight w:val="lightGray"/>
+          <w:lang w:eastAsia="pt-BR"/>
+        </w:rPr>
+        <w:t>).</w:t>
+      </w:r>
+    </w:p>
+    <w:p>
+      <w:pPr>
+        <w:spacing w:line="240" w:lineRule="auto"/>
+        <w:textAlignment w:val="baseline"/>
+      </w:pPr>
+    </w:p>
+    <w:p>
+      <w:pPr>
+        <w:spacing w:line="240" w:lineRule="auto"/>
+        <w:textAlignment w:val="baseline"/>
+      </w:pPr>
+    </w:p>
+    <w:p>
+      <w:pPr>
+        <w:pStyle w:val="Ttulo3"/>
+        <w:ind w:left="431" w:hanging="431"/>
+        <w:rPr>
+          <w:highlight w:val="yellow"/>
+        </w:rPr>
+      </w:pPr>
+      <w:bookmarkStart w:id="57" w:name="_Toc205138876"/>
+      <w:proofErr w:type="spellStart"/>
+      <w:r>
+        <w:rPr>
+          <w:highlight w:val="yellow"/>
+        </w:rPr>
+        <w:t>Algoritmo</w:t>
+      </w:r>
+      <w:proofErr w:type="spellEnd"/>
+      <w:r>
+        <w:rPr>
+          <w:highlight w:val="yellow"/>
+        </w:rPr>
+        <w:t xml:space="preserve"> CART (Classification and Regression Trees)</w:t>
+      </w:r>
+      <w:bookmarkEnd w:id="57"/>
+    </w:p>
+    <w:p>
+      <w:pPr>
+        <w:pStyle w:val="CorpodoTexto"/>
+        <w:ind w:firstLine="0"/>
+      </w:pPr>
+      <w:r>
+        <w:rPr>
+          <w:highlight w:val="lightGray"/>
+        </w:rPr>
+        <w:t>Detalhar o funcionamento do CART: critérios de divisão (Gini ou Entropia), profundidade, podas, vantagens e desvantagens.</w:t>
+      </w:r>
+      <w:r>
+        <w:rPr>
+          <w:highlight w:val="lightGray"/>
+        </w:rPr>
+        <w:br/>
+        <w:t>Exemplos de uso em saúde e previsão.</w:t>
       </w:r>
     </w:p>
     <w:p>
@@ -11486,30 +11790,19 @@
         <w:rPr>
           <w:rFonts w:eastAsia="Times New Roman" w:cs="Times New Roman"/>
           <w:szCs w:val="24"/>
-          <w:lang w:eastAsia="pt-BR"/>
-        </w:rPr>
-      </w:pPr>
-      <w:proofErr w:type="gramStart"/>
-      <w:r>
-        <w:rPr>
-          <w:rFonts w:eastAsia="Times New Roman" w:hAnsi="Symbol" w:cs="Times New Roman"/>
-          <w:szCs w:val="24"/>
           <w:highlight w:val="lightGray"/>
           <w:lang w:eastAsia="pt-BR"/>
         </w:rPr>
-        <w:lastRenderedPageBreak/>
-        <w:t></w:t>
-      </w:r>
-      <w:r>
-        <w:rPr>
-          <w:rFonts w:eastAsia="Times New Roman" w:cs="Times New Roman"/>
+      </w:pPr>
+      <w:r>
+        <w:rPr>
+          <w:rFonts w:eastAsia="Times New Roman" w:hAnsi="Symbol" w:cs="Times New Roman"/>
           <w:szCs w:val="24"/>
           <w:highlight w:val="lightGray"/>
           <w:lang w:eastAsia="pt-BR"/>
         </w:rPr>
-        <w:t xml:space="preserve">  Vantagens</w:t>
-      </w:r>
-      <w:proofErr w:type="gramEnd"/>
+        <w:t></w:t>
+      </w:r>
       <w:r>
         <w:rPr>
           <w:rFonts w:eastAsia="Times New Roman" w:cs="Times New Roman"/>
@@ -11517,29 +11810,29 @@
           <w:highlight w:val="lightGray"/>
           <w:lang w:eastAsia="pt-BR"/>
         </w:rPr>
-        <w:t xml:space="preserve"> (</w:t>
-      </w:r>
-      <w:proofErr w:type="spellStart"/>
-      <w:r>
+        <w:t xml:space="preserve">  Histórico e proposta do algoritmo.</w:t>
+      </w:r>
+    </w:p>
+    <w:p>
+      <w:pPr>
+        <w:spacing w:before="100" w:beforeAutospacing="1" w:after="100" w:afterAutospacing="1" w:line="240" w:lineRule="auto"/>
+        <w:jc w:val="left"/>
         <w:rPr>
           <w:rFonts w:eastAsia="Times New Roman" w:cs="Times New Roman"/>
           <w:szCs w:val="24"/>
           <w:highlight w:val="lightGray"/>
           <w:lang w:eastAsia="pt-BR"/>
         </w:rPr>
-        <w:t>interpretabilidade</w:t>
-      </w:r>
-      <w:proofErr w:type="spellEnd"/>
-      <w:r>
-        <w:rPr>
-          <w:rFonts w:eastAsia="Times New Roman" w:cs="Times New Roman"/>
+      </w:pPr>
+      <w:r>
+        <w:rPr>
+          <w:rFonts w:eastAsia="Times New Roman" w:hAnsi="Symbol" w:cs="Times New Roman"/>
           <w:szCs w:val="24"/>
           <w:highlight w:val="lightGray"/>
           <w:lang w:eastAsia="pt-BR"/>
         </w:rPr>
-        <w:t>, rapidez) e desvantagens (</w:t>
-      </w:r>
-      <w:proofErr w:type="spellStart"/>
+        <w:t></w:t>
+      </w:r>
       <w:r>
         <w:rPr>
           <w:rFonts w:eastAsia="Times New Roman" w:cs="Times New Roman"/>
@@ -11547,73 +11840,37 @@
           <w:highlight w:val="lightGray"/>
           <w:lang w:eastAsia="pt-BR"/>
         </w:rPr>
-        <w:t>overfitting</w:t>
-      </w:r>
-      <w:proofErr w:type="spellEnd"/>
-      <w:r>
+        <w:t xml:space="preserve">  Como ele realiza divisões com base no índice de Gini.</w:t>
+      </w:r>
+    </w:p>
+    <w:p>
+      <w:pPr>
+        <w:spacing w:before="100" w:beforeAutospacing="1" w:after="100" w:afterAutospacing="1" w:line="240" w:lineRule="auto"/>
+        <w:jc w:val="left"/>
         <w:rPr>
           <w:rFonts w:eastAsia="Times New Roman" w:cs="Times New Roman"/>
           <w:szCs w:val="24"/>
           <w:highlight w:val="lightGray"/>
           <w:lang w:eastAsia="pt-BR"/>
         </w:rPr>
-        <w:t>).</w:t>
-      </w:r>
-    </w:p>
-    <w:p>
-      <w:pPr>
-        <w:spacing w:line="240" w:lineRule="auto"/>
-        <w:textAlignment w:val="baseline"/>
-      </w:pPr>
-    </w:p>
-    <w:p>
-      <w:pPr>
-        <w:spacing w:line="240" w:lineRule="auto"/>
-        <w:textAlignment w:val="baseline"/>
-      </w:pPr>
-    </w:p>
-    <w:p>
-      <w:pPr>
-        <w:pStyle w:val="Ttulo3"/>
-        <w:ind w:left="431" w:hanging="431"/>
-        <w:rPr>
-          <w:highlight w:val="yellow"/>
-        </w:rPr>
-      </w:pPr>
-      <w:bookmarkStart w:id="57" w:name="_Toc203572614"/>
-      <w:proofErr w:type="spellStart"/>
-      <w:r>
-        <w:rPr>
-          <w:highlight w:val="yellow"/>
-        </w:rPr>
-        <w:t>Algoritmo</w:t>
-      </w:r>
-      <w:proofErr w:type="spellEnd"/>
-      <w:r>
-        <w:rPr>
-          <w:highlight w:val="yellow"/>
-        </w:rPr>
-        <w:t xml:space="preserve"> CART (Classification and Regression Trees)</w:t>
-      </w:r>
-      <w:bookmarkEnd w:id="57"/>
-    </w:p>
-    <w:p>
-      <w:pPr>
-        <w:pStyle w:val="CorpodoTexto"/>
-        <w:ind w:firstLine="0"/>
-      </w:pPr>
-      <w:r>
-        <w:rPr>
+      </w:pPr>
+      <w:r>
+        <w:rPr>
+          <w:rFonts w:eastAsia="Times New Roman" w:hAnsi="Symbol" w:cs="Times New Roman"/>
+          <w:szCs w:val="24"/>
           <w:highlight w:val="lightGray"/>
-        </w:rPr>
-        <w:t>Detalhar o funcionamento do CART: critérios de divisão (Gini ou Entropia), profundidade, podas, vantagens e desvantagens.</w:t>
-      </w:r>
-      <w:r>
-        <w:rPr>
+          <w:lang w:eastAsia="pt-BR"/>
+        </w:rPr>
+        <w:t></w:t>
+      </w:r>
+      <w:r>
+        <w:rPr>
+          <w:rFonts w:eastAsia="Times New Roman" w:cs="Times New Roman"/>
+          <w:szCs w:val="24"/>
           <w:highlight w:val="lightGray"/>
-        </w:rPr>
-        <w:br/>
-        <w:t>Exemplos de uso em saúde e previsão.</w:t>
+          <w:lang w:eastAsia="pt-BR"/>
+        </w:rPr>
+        <w:t xml:space="preserve">  Processo de criação da árvore, critérios de parada, e poda.</w:t>
       </w:r>
     </w:p>
     <w:p>
@@ -11627,7 +11884,6 @@
           <w:lang w:eastAsia="pt-BR"/>
         </w:rPr>
       </w:pPr>
-      <w:proofErr w:type="gramStart"/>
       <w:r>
         <w:rPr>
           <w:rFonts w:eastAsia="Times New Roman" w:hAnsi="Symbol" w:cs="Times New Roman"/>
@@ -11644,180 +11900,36 @@
           <w:highlight w:val="lightGray"/>
           <w:lang w:eastAsia="pt-BR"/>
         </w:rPr>
-        <w:t xml:space="preserve">  Histórico</w:t>
-      </w:r>
-      <w:proofErr w:type="gramEnd"/>
-      <w:r>
+        <w:t xml:space="preserve">  Aplicações no contexto de saúde ou esportes.</w:t>
+      </w:r>
+    </w:p>
+    <w:p>
+      <w:pPr>
+        <w:spacing w:before="100" w:beforeAutospacing="1" w:after="100" w:afterAutospacing="1" w:line="240" w:lineRule="auto"/>
+        <w:jc w:val="left"/>
         <w:rPr>
           <w:rFonts w:eastAsia="Times New Roman" w:cs="Times New Roman"/>
+          <w:szCs w:val="24"/>
+          <w:lang w:eastAsia="pt-BR"/>
+        </w:rPr>
+      </w:pPr>
+      <w:r>
+        <w:rPr>
+          <w:rFonts w:eastAsia="Times New Roman" w:hAnsi="Symbol" w:cs="Times New Roman"/>
           <w:szCs w:val="24"/>
           <w:highlight w:val="lightGray"/>
           <w:lang w:eastAsia="pt-BR"/>
         </w:rPr>
-        <w:t xml:space="preserve"> e proposta do algoritmo.</w:t>
-      </w:r>
-    </w:p>
-    <w:p>
-      <w:pPr>
-        <w:spacing w:before="100" w:beforeAutospacing="1" w:after="100" w:afterAutospacing="1" w:line="240" w:lineRule="auto"/>
-        <w:jc w:val="left"/>
+        <w:t></w:t>
+      </w:r>
+      <w:r>
         <w:rPr>
           <w:rFonts w:eastAsia="Times New Roman" w:cs="Times New Roman"/>
           <w:szCs w:val="24"/>
           <w:highlight w:val="lightGray"/>
           <w:lang w:eastAsia="pt-BR"/>
         </w:rPr>
-      </w:pPr>
-      <w:proofErr w:type="gramStart"/>
-      <w:r>
-        <w:rPr>
-          <w:rFonts w:eastAsia="Times New Roman" w:hAnsi="Symbol" w:cs="Times New Roman"/>
-          <w:szCs w:val="24"/>
-          <w:highlight w:val="lightGray"/>
-          <w:lang w:eastAsia="pt-BR"/>
-        </w:rPr>
-        <w:t></w:t>
-      </w:r>
-      <w:r>
-        <w:rPr>
-          <w:rFonts w:eastAsia="Times New Roman" w:cs="Times New Roman"/>
-          <w:szCs w:val="24"/>
-          <w:highlight w:val="lightGray"/>
-          <w:lang w:eastAsia="pt-BR"/>
-        </w:rPr>
-        <w:t xml:space="preserve">  Como</w:t>
-      </w:r>
-      <w:proofErr w:type="gramEnd"/>
-      <w:r>
-        <w:rPr>
-          <w:rFonts w:eastAsia="Times New Roman" w:cs="Times New Roman"/>
-          <w:szCs w:val="24"/>
-          <w:highlight w:val="lightGray"/>
-          <w:lang w:eastAsia="pt-BR"/>
-        </w:rPr>
-        <w:t xml:space="preserve"> ele realiza divisões com base no índice de Gini.</w:t>
-      </w:r>
-    </w:p>
-    <w:p>
-      <w:pPr>
-        <w:spacing w:before="100" w:beforeAutospacing="1" w:after="100" w:afterAutospacing="1" w:line="240" w:lineRule="auto"/>
-        <w:jc w:val="left"/>
-        <w:rPr>
-          <w:rFonts w:eastAsia="Times New Roman" w:cs="Times New Roman"/>
-          <w:szCs w:val="24"/>
-          <w:highlight w:val="lightGray"/>
-          <w:lang w:eastAsia="pt-BR"/>
-        </w:rPr>
-      </w:pPr>
-      <w:proofErr w:type="gramStart"/>
-      <w:r>
-        <w:rPr>
-          <w:rFonts w:eastAsia="Times New Roman" w:hAnsi="Symbol" w:cs="Times New Roman"/>
-          <w:szCs w:val="24"/>
-          <w:highlight w:val="lightGray"/>
-          <w:lang w:eastAsia="pt-BR"/>
-        </w:rPr>
-        <w:t></w:t>
-      </w:r>
-      <w:r>
-        <w:rPr>
-          <w:rFonts w:eastAsia="Times New Roman" w:cs="Times New Roman"/>
-          <w:szCs w:val="24"/>
-          <w:highlight w:val="lightGray"/>
-          <w:lang w:eastAsia="pt-BR"/>
-        </w:rPr>
-        <w:t xml:space="preserve">  Processo</w:t>
-      </w:r>
-      <w:proofErr w:type="gramEnd"/>
-      <w:r>
-        <w:rPr>
-          <w:rFonts w:eastAsia="Times New Roman" w:cs="Times New Roman"/>
-          <w:szCs w:val="24"/>
-          <w:highlight w:val="lightGray"/>
-          <w:lang w:eastAsia="pt-BR"/>
-        </w:rPr>
-        <w:t xml:space="preserve"> de criação da árvore, critérios de parada, e poda.</w:t>
-      </w:r>
-    </w:p>
-    <w:p>
-      <w:pPr>
-        <w:spacing w:before="100" w:beforeAutospacing="1" w:after="100" w:afterAutospacing="1" w:line="240" w:lineRule="auto"/>
-        <w:jc w:val="left"/>
-        <w:rPr>
-          <w:rFonts w:eastAsia="Times New Roman" w:cs="Times New Roman"/>
-          <w:szCs w:val="24"/>
-          <w:highlight w:val="lightGray"/>
-          <w:lang w:eastAsia="pt-BR"/>
-        </w:rPr>
-      </w:pPr>
-      <w:proofErr w:type="gramStart"/>
-      <w:r>
-        <w:rPr>
-          <w:rFonts w:eastAsia="Times New Roman" w:hAnsi="Symbol" w:cs="Times New Roman"/>
-          <w:szCs w:val="24"/>
-          <w:highlight w:val="lightGray"/>
-          <w:lang w:eastAsia="pt-BR"/>
-        </w:rPr>
-        <w:t></w:t>
-      </w:r>
-      <w:r>
-        <w:rPr>
-          <w:rFonts w:eastAsia="Times New Roman" w:cs="Times New Roman"/>
-          <w:szCs w:val="24"/>
-          <w:highlight w:val="lightGray"/>
-          <w:lang w:eastAsia="pt-BR"/>
-        </w:rPr>
-        <w:t xml:space="preserve">  Aplicações</w:t>
-      </w:r>
-      <w:proofErr w:type="gramEnd"/>
-      <w:r>
-        <w:rPr>
-          <w:rFonts w:eastAsia="Times New Roman" w:cs="Times New Roman"/>
-          <w:szCs w:val="24"/>
-          <w:highlight w:val="lightGray"/>
-          <w:lang w:eastAsia="pt-BR"/>
-        </w:rPr>
-        <w:t xml:space="preserve"> no contexto de saúde ou esportes.</w:t>
-      </w:r>
-    </w:p>
-    <w:p>
-      <w:pPr>
-        <w:spacing w:before="100" w:beforeAutospacing="1" w:after="100" w:afterAutospacing="1" w:line="240" w:lineRule="auto"/>
-        <w:jc w:val="left"/>
-        <w:rPr>
-          <w:rFonts w:eastAsia="Times New Roman" w:cs="Times New Roman"/>
-          <w:szCs w:val="24"/>
-          <w:lang w:eastAsia="pt-BR"/>
-        </w:rPr>
-      </w:pPr>
-      <w:proofErr w:type="gramStart"/>
-      <w:r>
-        <w:rPr>
-          <w:rFonts w:eastAsia="Times New Roman" w:hAnsi="Symbol" w:cs="Times New Roman"/>
-          <w:szCs w:val="24"/>
-          <w:highlight w:val="lightGray"/>
-          <w:lang w:eastAsia="pt-BR"/>
-        </w:rPr>
-        <w:t></w:t>
-      </w:r>
-      <w:r>
-        <w:rPr>
-          <w:rFonts w:eastAsia="Times New Roman" w:cs="Times New Roman"/>
-          <w:szCs w:val="24"/>
-          <w:highlight w:val="lightGray"/>
-          <w:lang w:eastAsia="pt-BR"/>
-        </w:rPr>
-        <w:t xml:space="preserve">  Vantagens</w:t>
-      </w:r>
-      <w:proofErr w:type="gramEnd"/>
-      <w:r>
-        <w:rPr>
-          <w:rFonts w:eastAsia="Times New Roman" w:cs="Times New Roman"/>
-          <w:szCs w:val="24"/>
-          <w:highlight w:val="lightGray"/>
-          <w:lang w:eastAsia="pt-BR"/>
-        </w:rPr>
-        <w:t xml:space="preserve"> e limitações.</w:t>
+        <w:t xml:space="preserve">  Vantagens e limitações.</w:t>
       </w:r>
     </w:p>
     <w:p>
@@ -11856,8 +11968,8 @@
           <w:highlight w:val="yellow"/>
         </w:rPr>
       </w:pPr>
-      <w:bookmarkStart w:id="58" w:name="_Toc203572615"/>
-      <w:bookmarkStart w:id="59" w:name="_Hlk203572362"/>
+      <w:bookmarkStart w:id="58" w:name="_Hlk203572362"/>
+      <w:bookmarkStart w:id="59" w:name="_Toc205138877"/>
       <w:commentRangeStart w:id="60"/>
       <w:r>
         <w:rPr>
@@ -11882,7 +11994,7 @@
         </w:rPr>
         <w:commentReference w:id="60"/>
       </w:r>
-      <w:bookmarkEnd w:id="58"/>
+      <w:bookmarkEnd w:id="59"/>
     </w:p>
     <w:p>
       <w:pPr>
@@ -11895,7 +12007,6 @@
           <w:lang w:eastAsia="pt-BR"/>
         </w:rPr>
       </w:pPr>
-      <w:proofErr w:type="gramStart"/>
       <w:r>
         <w:rPr>
           <w:rFonts w:eastAsia="Times New Roman" w:hAnsi="Symbol" w:cs="Times New Roman"/>
@@ -11912,17 +12023,37 @@
           <w:highlight w:val="lightGray"/>
           <w:lang w:eastAsia="pt-BR"/>
         </w:rPr>
-        <w:t xml:space="preserve">  Definições</w:t>
-      </w:r>
-      <w:proofErr w:type="gramEnd"/>
-      <w:r>
+        <w:t xml:space="preserve">  Definições formais de Acurácia, Precisão, Recall, F1-Score, AUC-ROC, Matriz de Confusão.</w:t>
+      </w:r>
+    </w:p>
+    <w:p>
+      <w:pPr>
+        <w:spacing w:before="100" w:beforeAutospacing="1" w:after="100" w:afterAutospacing="1" w:line="240" w:lineRule="auto"/>
+        <w:jc w:val="left"/>
         <w:rPr>
           <w:rFonts w:eastAsia="Times New Roman" w:cs="Times New Roman"/>
           <w:szCs w:val="24"/>
           <w:highlight w:val="lightGray"/>
           <w:lang w:eastAsia="pt-BR"/>
         </w:rPr>
-        <w:t xml:space="preserve"> formais de Acurácia, Precisão, Recall, F1-Score, AUC-ROC, Matriz de Confusão.</w:t>
+      </w:pPr>
+      <w:r>
+        <w:rPr>
+          <w:rFonts w:eastAsia="Times New Roman" w:hAnsi="Symbol" w:cs="Times New Roman"/>
+          <w:szCs w:val="24"/>
+          <w:highlight w:val="lightGray"/>
+          <w:lang w:eastAsia="pt-BR"/>
+        </w:rPr>
+        <w:t></w:t>
+      </w:r>
+      <w:r>
+        <w:rPr>
+          <w:rFonts w:eastAsia="Times New Roman" w:cs="Times New Roman"/>
+          <w:szCs w:val="24"/>
+          <w:highlight w:val="lightGray"/>
+          <w:lang w:eastAsia="pt-BR"/>
+        </w:rPr>
+        <w:t xml:space="preserve">  Gráficos ilustrativos se possível (para facilitar a compreensão de AUC, por exemplo).</w:t>
       </w:r>
     </w:p>
     <w:p>
@@ -11932,20 +12063,28 @@
         <w:rPr>
           <w:rFonts w:eastAsia="Times New Roman" w:cs="Times New Roman"/>
           <w:szCs w:val="24"/>
+          <w:lang w:eastAsia="pt-BR"/>
+        </w:rPr>
+      </w:pPr>
+      <w:r>
+        <w:rPr>
+          <w:rFonts w:eastAsia="Times New Roman" w:hAnsi="Symbol" w:cs="Times New Roman"/>
+          <w:szCs w:val="24"/>
           <w:highlight w:val="lightGray"/>
           <w:lang w:eastAsia="pt-BR"/>
         </w:rPr>
-      </w:pPr>
-      <w:proofErr w:type="gramStart"/>
-      <w:r>
-        <w:rPr>
-          <w:rFonts w:eastAsia="Times New Roman" w:hAnsi="Symbol" w:cs="Times New Roman"/>
+        <w:t></w:t>
+      </w:r>
+      <w:r>
+        <w:rPr>
+          <w:rFonts w:eastAsia="Times New Roman" w:cs="Times New Roman"/>
           <w:szCs w:val="24"/>
           <w:highlight w:val="lightGray"/>
           <w:lang w:eastAsia="pt-BR"/>
         </w:rPr>
-        <w:t></w:t>
-      </w:r>
+        <w:t xml:space="preserve">  Justificativa das métricas escolhidas para o problema (</w:t>
+      </w:r>
+      <w:proofErr w:type="spellStart"/>
       <w:r>
         <w:rPr>
           <w:rFonts w:eastAsia="Times New Roman" w:cs="Times New Roman"/>
@@ -11953,9 +12092,9 @@
           <w:highlight w:val="lightGray"/>
           <w:lang w:eastAsia="pt-BR"/>
         </w:rPr>
-        <w:t xml:space="preserve">  Gráficos</w:t>
-      </w:r>
-      <w:proofErr w:type="gramEnd"/>
+        <w:t>ex</w:t>
+      </w:r>
+      <w:proofErr w:type="spellEnd"/>
       <w:r>
         <w:rPr>
           <w:rFonts w:eastAsia="Times New Roman" w:cs="Times New Roman"/>
@@ -11963,66 +12102,6 @@
           <w:highlight w:val="lightGray"/>
           <w:lang w:eastAsia="pt-BR"/>
         </w:rPr>
-        <w:t xml:space="preserve"> ilustrativos se possível (para facilitar a compreensão de AUC, por exemplo).</w:t>
-      </w:r>
-    </w:p>
-    <w:p>
-      <w:pPr>
-        <w:spacing w:before="100" w:beforeAutospacing="1" w:after="100" w:afterAutospacing="1" w:line="240" w:lineRule="auto"/>
-        <w:jc w:val="left"/>
-        <w:rPr>
-          <w:rFonts w:eastAsia="Times New Roman" w:cs="Times New Roman"/>
-          <w:szCs w:val="24"/>
-          <w:lang w:eastAsia="pt-BR"/>
-        </w:rPr>
-      </w:pPr>
-      <w:proofErr w:type="gramStart"/>
-      <w:r>
-        <w:rPr>
-          <w:rFonts w:eastAsia="Times New Roman" w:hAnsi="Symbol" w:cs="Times New Roman"/>
-          <w:szCs w:val="24"/>
-          <w:highlight w:val="lightGray"/>
-          <w:lang w:eastAsia="pt-BR"/>
-        </w:rPr>
-        <w:t></w:t>
-      </w:r>
-      <w:r>
-        <w:rPr>
-          <w:rFonts w:eastAsia="Times New Roman" w:cs="Times New Roman"/>
-          <w:szCs w:val="24"/>
-          <w:highlight w:val="lightGray"/>
-          <w:lang w:eastAsia="pt-BR"/>
-        </w:rPr>
-        <w:t xml:space="preserve">  Justificativa</w:t>
-      </w:r>
-      <w:proofErr w:type="gramEnd"/>
-      <w:r>
-        <w:rPr>
-          <w:rFonts w:eastAsia="Times New Roman" w:cs="Times New Roman"/>
-          <w:szCs w:val="24"/>
-          <w:highlight w:val="lightGray"/>
-          <w:lang w:eastAsia="pt-BR"/>
-        </w:rPr>
-        <w:t xml:space="preserve"> das métricas escolhidas para o problema (</w:t>
-      </w:r>
-      <w:proofErr w:type="spellStart"/>
-      <w:r>
-        <w:rPr>
-          <w:rFonts w:eastAsia="Times New Roman" w:cs="Times New Roman"/>
-          <w:szCs w:val="24"/>
-          <w:highlight w:val="lightGray"/>
-          <w:lang w:eastAsia="pt-BR"/>
-        </w:rPr>
-        <w:t>ex</w:t>
-      </w:r>
-      <w:proofErr w:type="spellEnd"/>
-      <w:r>
-        <w:rPr>
-          <w:rFonts w:eastAsia="Times New Roman" w:cs="Times New Roman"/>
-          <w:szCs w:val="24"/>
-          <w:highlight w:val="lightGray"/>
-          <w:lang w:eastAsia="pt-BR"/>
-        </w:rPr>
         <w:t>: F1-score por causa de desbalanceamento).</w:t>
       </w:r>
     </w:p>
@@ -12053,7 +12132,7 @@
         </w:rPr>
         <w:t xml:space="preserve"> </w:t>
       </w:r>
-      <w:bookmarkStart w:id="61" w:name="_Toc203572616"/>
+      <w:bookmarkStart w:id="61" w:name="_Toc205138878"/>
       <w:r>
         <w:rPr>
           <w:highlight w:val="yellow"/>
@@ -12287,7 +12366,7 @@
         <w:t xml:space="preserve"> melhorou o desempenho em 9 dos 11 hospitais testados. O estudo conclui que essa técnica pode acelerar o treinamento de modelos em locais com menos dados ou menor desempenho preditivo, promovendo maior adaptabilidade e eficiência na gestão hospitalar e na tomada de decisões clínicas em contextos diversos.</w:t>
       </w:r>
     </w:p>
-    <w:bookmarkEnd w:id="59"/>
+    <w:bookmarkEnd w:id="58"/>
     <w:p>
       <w:pPr>
         <w:spacing w:line="240" w:lineRule="auto"/>
@@ -12315,9 +12394,9 @@
         </w:rPr>
       </w:pPr>
       <w:bookmarkStart w:id="62" w:name="_Toc203431587"/>
-      <w:bookmarkStart w:id="63" w:name="_Toc203572617"/>
-      <w:bookmarkStart w:id="64" w:name="_Hlk203572430"/>
-      <w:bookmarkEnd w:id="12"/>
+      <w:bookmarkStart w:id="63" w:name="_Hlk203572430"/>
+      <w:bookmarkStart w:id="64" w:name="_Toc205138879"/>
+      <w:bookmarkEnd w:id="11"/>
       <w:r>
         <w:rPr>
           <w:highlight w:val="yellow"/>
@@ -12326,7 +12405,7 @@
         <w:t>METODOLOGIA</w:t>
       </w:r>
       <w:bookmarkEnd w:id="62"/>
-      <w:bookmarkEnd w:id="63"/>
+      <w:bookmarkEnd w:id="64"/>
       <w:r>
         <w:rPr>
           <w:highlight w:val="yellow"/>
@@ -12850,7 +12929,7 @@
           <w:bCs/>
         </w:rPr>
       </w:pPr>
-      <w:bookmarkStart w:id="65" w:name="_Toc203572618"/>
+      <w:bookmarkStart w:id="65" w:name="_Toc205138880"/>
       <w:r>
         <w:rPr>
           <w:bCs/>
@@ -12866,7 +12945,7 @@
           <w:bCs/>
         </w:rPr>
       </w:pPr>
-      <w:bookmarkStart w:id="66" w:name="_Toc203572619"/>
+      <w:bookmarkStart w:id="66" w:name="_Toc205138881"/>
       <w:proofErr w:type="spellStart"/>
       <w:r>
         <w:rPr>
@@ -12884,7 +12963,7 @@
           <w:bCs/>
         </w:rPr>
       </w:pPr>
-      <w:bookmarkStart w:id="67" w:name="_Toc203572620"/>
+      <w:bookmarkStart w:id="67" w:name="_Toc205138882"/>
       <w:r>
         <w:rPr>
           <w:bCs/>
@@ -12900,7 +12979,7 @@
           <w:bCs/>
         </w:rPr>
       </w:pPr>
-      <w:bookmarkStart w:id="68" w:name="_Toc203572621"/>
+      <w:bookmarkStart w:id="68" w:name="_Toc205138883"/>
       <w:r>
         <w:rPr>
           <w:bCs/>
@@ -12916,7 +12995,7 @@
           <w:bCs/>
         </w:rPr>
       </w:pPr>
-      <w:bookmarkStart w:id="69" w:name="_Toc203572622"/>
+      <w:bookmarkStart w:id="69" w:name="_Toc205138884"/>
       <w:r>
         <w:rPr>
           <w:bCs/>
@@ -12940,7 +13019,7 @@
           <w:bCs/>
         </w:rPr>
       </w:pPr>
-      <w:bookmarkStart w:id="70" w:name="_Toc203572623"/>
+      <w:bookmarkStart w:id="70" w:name="_Toc205138885"/>
       <w:r>
         <w:rPr>
           <w:bCs/>
@@ -12949,7 +13028,7 @@
       </w:r>
       <w:bookmarkEnd w:id="70"/>
     </w:p>
-    <w:bookmarkEnd w:id="64"/>
+    <w:bookmarkEnd w:id="63"/>
     <w:p>
       <w:pPr>
         <w:rPr>
@@ -12981,8 +13060,8 @@
           <w:highlight w:val="yellow"/>
         </w:rPr>
       </w:pPr>
-      <w:bookmarkStart w:id="71" w:name="_Toc203572624"/>
-      <w:bookmarkStart w:id="72" w:name="_Hlk203572438"/>
+      <w:bookmarkStart w:id="71" w:name="_Hlk203572438"/>
+      <w:bookmarkStart w:id="72" w:name="_Toc205138886"/>
       <w:r>
         <w:rPr>
           <w:highlight w:val="yellow"/>
@@ -12990,7 +13069,7 @@
         <w:lastRenderedPageBreak/>
         <w:t>RESULTADOS</w:t>
       </w:r>
-      <w:bookmarkEnd w:id="71"/>
+      <w:bookmarkEnd w:id="72"/>
       <w:r>
         <w:rPr>
           <w:highlight w:val="yellow"/>
@@ -13350,7 +13429,7 @@
           <w:highlight w:val="yellow"/>
         </w:rPr>
       </w:pPr>
-      <w:bookmarkStart w:id="73" w:name="_Toc203572625"/>
+      <w:bookmarkStart w:id="73" w:name="_Toc205138887"/>
       <w:r>
         <w:rPr>
           <w:noProof/>
@@ -13367,12 +13446,14 @@
           <w:highlight w:val="yellow"/>
         </w:rPr>
       </w:pPr>
+      <w:bookmarkStart w:id="74" w:name="_Toc205138888"/>
       <w:r>
         <w:rPr>
           <w:highlight w:val="yellow"/>
         </w:rPr>
         <w:t>Random Forest</w:t>
       </w:r>
+      <w:bookmarkEnd w:id="74"/>
     </w:p>
     <w:p>
       <w:pPr>
@@ -13381,12 +13462,14 @@
           <w:highlight w:val="yellow"/>
         </w:rPr>
       </w:pPr>
+      <w:bookmarkStart w:id="75" w:name="_Toc205138889"/>
       <w:r>
         <w:rPr>
           <w:highlight w:val="yellow"/>
         </w:rPr>
         <w:t>Cart</w:t>
       </w:r>
+      <w:bookmarkEnd w:id="75"/>
     </w:p>
     <w:p>
       <w:pPr>
@@ -13405,7 +13488,7 @@
           <w:lang w:val="pt-BR"/>
         </w:rPr>
       </w:pPr>
-      <w:bookmarkStart w:id="74" w:name="_Toc203572626"/>
+      <w:bookmarkStart w:id="76" w:name="_Toc205138890"/>
       <w:r>
         <w:rPr>
           <w:noProof/>
@@ -13414,7 +13497,7 @@
         </w:rPr>
         <w:t>Comparação</w:t>
       </w:r>
-      <w:bookmarkEnd w:id="74"/>
+      <w:bookmarkEnd w:id="76"/>
     </w:p>
     <w:p>
       <w:pPr>
@@ -13423,12 +13506,14 @@
           <w:highlight w:val="yellow"/>
         </w:rPr>
       </w:pPr>
+      <w:bookmarkStart w:id="77" w:name="_Toc205138891"/>
       <w:r>
         <w:rPr>
           <w:highlight w:val="yellow"/>
         </w:rPr>
         <w:t>Comparação dos modelos</w:t>
       </w:r>
+      <w:bookmarkEnd w:id="77"/>
     </w:p>
     <w:p>
       <w:pPr>
@@ -13439,7 +13524,8 @@
           <w:lang w:val="pt-BR"/>
         </w:rPr>
       </w:pPr>
-      <w:bookmarkStart w:id="75" w:name="_Toc203566827"/>
+      <w:bookmarkStart w:id="78" w:name="_Toc203566827"/>
+      <w:bookmarkStart w:id="79" w:name="_Toc205138892"/>
       <w:r>
         <w:rPr>
           <w:noProof/>
@@ -13448,7 +13534,8 @@
         </w:rPr>
         <w:t>Comparação de Tempo de Execução</w:t>
       </w:r>
-      <w:bookmarkEnd w:id="75"/>
+      <w:bookmarkEnd w:id="78"/>
+      <w:bookmarkEnd w:id="79"/>
     </w:p>
     <w:p>
       <w:pPr>
@@ -13457,7 +13544,7 @@
         </w:rPr>
       </w:pPr>
     </w:p>
-    <w:bookmarkEnd w:id="72"/>
+    <w:bookmarkEnd w:id="71"/>
     <w:p>
       <w:r>
         <w:br w:type="page"/>
@@ -13470,9 +13557,9 @@
           <w:highlight w:val="yellow"/>
         </w:rPr>
       </w:pPr>
-      <w:bookmarkStart w:id="76" w:name="_Toc203431589"/>
-      <w:bookmarkStart w:id="77" w:name="_Toc203572627"/>
-      <w:bookmarkStart w:id="78" w:name="_Hlk203572459"/>
+      <w:bookmarkStart w:id="80" w:name="_Toc203431589"/>
+      <w:bookmarkStart w:id="81" w:name="_Hlk203572459"/>
+      <w:bookmarkStart w:id="82" w:name="_Toc205138893"/>
       <w:r>
         <w:rPr>
           <w:highlight w:val="yellow"/>
@@ -13480,8 +13567,8 @@
         <w:lastRenderedPageBreak/>
         <w:t>DISCUSSÃO</w:t>
       </w:r>
-      <w:bookmarkEnd w:id="76"/>
-      <w:bookmarkEnd w:id="77"/>
+      <w:bookmarkEnd w:id="80"/>
+      <w:bookmarkEnd w:id="82"/>
       <w:r>
         <w:rPr>
           <w:highlight w:val="yellow"/>
@@ -13729,7 +13816,7 @@
         <w:t>Potenciais melhorias e sugestões para trabalhos futuros</w:t>
       </w:r>
     </w:p>
-    <w:bookmarkEnd w:id="78"/>
+    <w:bookmarkEnd w:id="81"/>
     <w:p>
       <w:pPr>
         <w:ind w:firstLine="709"/>
@@ -13752,9 +13839,9 @@
           <w:highlight w:val="yellow"/>
         </w:rPr>
       </w:pPr>
-      <w:bookmarkStart w:id="79" w:name="_Toc203431590"/>
-      <w:bookmarkStart w:id="80" w:name="_Toc203572628"/>
-      <w:bookmarkStart w:id="81" w:name="_Hlk203572470"/>
+      <w:bookmarkStart w:id="83" w:name="_Toc203431590"/>
+      <w:bookmarkStart w:id="84" w:name="_Hlk203572470"/>
+      <w:bookmarkStart w:id="85" w:name="_Toc205138894"/>
       <w:r>
         <w:rPr>
           <w:highlight w:val="yellow"/>
@@ -13762,8 +13849,8 @@
         <w:lastRenderedPageBreak/>
         <w:t>CONCLUSÃO</w:t>
       </w:r>
-      <w:bookmarkEnd w:id="79"/>
-      <w:bookmarkEnd w:id="80"/>
+      <w:bookmarkEnd w:id="83"/>
+      <w:bookmarkEnd w:id="85"/>
     </w:p>
     <w:p>
       <w:pPr>
@@ -13986,7 +14073,7 @@
           <w:highlight w:val="yellow"/>
         </w:rPr>
       </w:pPr>
-      <w:bookmarkStart w:id="82" w:name="_Toc203572629"/>
+      <w:bookmarkStart w:id="86" w:name="_Toc205138895"/>
       <w:r>
         <w:rPr>
           <w:highlight w:val="yellow"/>
@@ -14000,10 +14087,10 @@
         </w:rPr>
         <w:t>Futuros</w:t>
       </w:r>
-      <w:bookmarkEnd w:id="82"/>
+      <w:bookmarkEnd w:id="86"/>
       <w:proofErr w:type="spellEnd"/>
     </w:p>
-    <w:bookmarkEnd w:id="81"/>
+    <w:bookmarkEnd w:id="84"/>
     <w:p>
       <w:pPr>
         <w:pStyle w:val="CorpodoTexto"/>
@@ -14035,9 +14122,9 @@
           <w:b/>
         </w:rPr>
       </w:pPr>
-      <w:bookmarkStart w:id="83" w:name="_Toc501452038"/>
-      <w:bookmarkStart w:id="84" w:name="_Toc506198222"/>
-      <w:bookmarkStart w:id="85" w:name="_Toc506198418"/>
+      <w:bookmarkStart w:id="87" w:name="_Toc501452038"/>
+      <w:bookmarkStart w:id="88" w:name="_Toc506198222"/>
+      <w:bookmarkStart w:id="89" w:name="_Toc506198418"/>
       <w:r>
         <w:br w:type="page"/>
       </w:r>
@@ -14046,18 +14133,18 @@
       <w:pPr>
         <w:pStyle w:val="Ttulo1"/>
       </w:pPr>
-      <w:bookmarkStart w:id="86" w:name="_Toc203572630"/>
-      <w:bookmarkStart w:id="87" w:name="_Hlk203572480"/>
+      <w:bookmarkStart w:id="90" w:name="_Hlk203572480"/>
+      <w:bookmarkStart w:id="91" w:name="_Toc205138896"/>
       <w:r>
         <w:lastRenderedPageBreak/>
         <w:t>REFERÊNCIAS BIBLIOGRÁFICAS</w:t>
       </w:r>
-      <w:bookmarkEnd w:id="83"/>
-      <w:bookmarkEnd w:id="84"/>
-      <w:bookmarkEnd w:id="85"/>
-      <w:bookmarkEnd w:id="86"/>
-    </w:p>
-    <w:bookmarkEnd w:id="87"/>
+      <w:bookmarkEnd w:id="87"/>
+      <w:bookmarkEnd w:id="88"/>
+      <w:bookmarkEnd w:id="89"/>
+      <w:bookmarkEnd w:id="91"/>
+    </w:p>
+    <w:bookmarkEnd w:id="90"/>
     <w:p/>
     <w:p>
       <w:pPr>
@@ -14645,7 +14732,6 @@
         <w:t>K-</w:t>
       </w:r>
       <w:proofErr w:type="spellStart"/>
-      <w:proofErr w:type="gramStart"/>
       <w:r>
         <w:rPr>
           <w:rFonts w:cs="Times New Roman"/>
@@ -14656,7 +14742,6 @@
         <w:t>means</w:t>
       </w:r>
       <w:proofErr w:type="spellEnd"/>
-      <w:proofErr w:type="gramEnd"/>
       <w:r>
         <w:rPr>
           <w:rFonts w:cs="Times New Roman"/>
@@ -14900,7 +14985,7 @@
         </w:rPr>
         <w:t xml:space="preserve"> dos Anjos. </w:t>
       </w:r>
-      <w:commentRangeStart w:id="88"/>
+      <w:commentRangeStart w:id="92"/>
       <w:r>
         <w:rPr>
           <w:rFonts w:cs="Times New Roman"/>
@@ -14910,12 +14995,12 @@
         </w:rPr>
         <w:t>Mineração</w:t>
       </w:r>
-      <w:commentRangeEnd w:id="88"/>
+      <w:commentRangeEnd w:id="92"/>
       <w:r>
         <w:rPr>
           <w:rStyle w:val="Refdecomentrio"/>
         </w:rPr>
-        <w:commentReference w:id="88"/>
+        <w:commentReference w:id="92"/>
       </w:r>
       <w:r>
         <w:rPr>
@@ -15570,7 +15655,7 @@
           <w:lang w:val="en-US"/>
         </w:rPr>
       </w:pPr>
-      <w:commentRangeStart w:id="89"/>
+      <w:commentRangeStart w:id="93"/>
       <w:r>
         <w:rPr>
           <w:highlight w:val="yellow"/>
@@ -15616,19 +15701,19 @@
         </w:rPr>
         <w:t xml:space="preserve"> 2024. DOI:10.1186/s12889-024-18815-0.</w:t>
       </w:r>
-      <w:commentRangeEnd w:id="89"/>
+      <w:commentRangeEnd w:id="93"/>
       <w:r>
         <w:rPr>
           <w:rStyle w:val="Refdecomentrio"/>
         </w:rPr>
-        <w:commentReference w:id="89"/>
+        <w:commentReference w:id="93"/>
       </w:r>
     </w:p>
     <w:p>
       <w:pPr>
         <w:spacing w:after="200" w:line="276" w:lineRule="auto"/>
       </w:pPr>
-      <w:commentRangeStart w:id="90"/>
+      <w:commentRangeStart w:id="94"/>
       <w:r>
         <w:rPr>
           <w:highlight w:val="yellow"/>
@@ -15708,12 +15793,12 @@
         </w:rPr>
         <w:t>. Acesso em: 21 jul. 2025</w:t>
       </w:r>
-      <w:commentRangeEnd w:id="90"/>
+      <w:commentRangeEnd w:id="94"/>
       <w:r>
         <w:rPr>
           <w:rStyle w:val="Refdecomentrio"/>
         </w:rPr>
-        <w:commentReference w:id="90"/>
+        <w:commentReference w:id="94"/>
       </w:r>
       <w:r>
         <w:t>.</w:t>
@@ -15732,7 +15817,7 @@
           <w:numId w:val="0"/>
         </w:numPr>
       </w:pPr>
-      <w:bookmarkStart w:id="91" w:name="_Toc203431592"/>
+      <w:bookmarkStart w:id="95" w:name="_Toc203431592"/>
       <w:r>
         <w:rPr>
           <w:highlight w:val="yellow"/>
@@ -15740,7 +15825,7 @@
         <w:lastRenderedPageBreak/>
         <w:t xml:space="preserve">APÊNDICE A – </w:t>
       </w:r>
-      <w:bookmarkEnd w:id="91"/>
+      <w:bookmarkEnd w:id="95"/>
       <w:r>
         <w:rPr>
           <w:highlight w:val="yellow"/>
@@ -15822,7 +15907,7 @@
           <w:numId w:val="0"/>
         </w:numPr>
       </w:pPr>
-      <w:bookmarkStart w:id="92" w:name="_Toc203431593"/>
+      <w:bookmarkStart w:id="96" w:name="_Toc203431593"/>
       <w:r>
         <w:rPr>
           <w:highlight w:val="yellow"/>
@@ -16279,7 +16364,7 @@
           <w:numId w:val="0"/>
         </w:numPr>
       </w:pPr>
-      <w:commentRangeStart w:id="93"/>
+      <w:commentRangeStart w:id="97"/>
       <w:r>
         <w:rPr>
           <w:highlight w:val="yellow"/>
@@ -16305,14 +16390,14 @@
         </w:rPr>
         <w:t xml:space="preserve">– </w:t>
       </w:r>
-      <w:bookmarkEnd w:id="92"/>
+      <w:bookmarkEnd w:id="96"/>
       <w:r>
         <w:rPr>
           <w:highlight w:val="yellow"/>
         </w:rPr>
         <w:t>Analise Exploratória dos Dados ??</w:t>
       </w:r>
-      <w:commentRangeEnd w:id="93"/>
+      <w:commentRangeEnd w:id="97"/>
       <w:r>
         <w:rPr>
           <w:rStyle w:val="Refdecomentrio"/>
@@ -16323,7 +16408,7 @@
           <w:kern w:val="0"/>
           <w:lang w:eastAsia="en-US"/>
         </w:rPr>
-        <w:commentReference w:id="93"/>
+        <w:commentReference w:id="97"/>
       </w:r>
     </w:p>
     <w:p>
@@ -16344,8 +16429,8 @@
       <w:r>
         <w:br w:type="page"/>
       </w:r>
-      <w:bookmarkStart w:id="94" w:name="_Toc343785724"/>
-      <w:bookmarkStart w:id="95" w:name="_Toc14264370"/>
+      <w:bookmarkStart w:id="98" w:name="_Toc343785724"/>
+      <w:bookmarkStart w:id="99" w:name="_Toc14264370"/>
       <w:r>
         <w:rPr>
           <w:b/>
@@ -16357,8 +16442,8 @@
         <w:lastRenderedPageBreak/>
         <w:t xml:space="preserve">ANEXO A – </w:t>
       </w:r>
-      <w:bookmarkEnd w:id="94"/>
-      <w:bookmarkEnd w:id="95"/>
+      <w:bookmarkEnd w:id="98"/>
+      <w:bookmarkEnd w:id="99"/>
       <w:r>
         <w:rPr>
           <w:b/>
@@ -16409,16 +16494,16 @@
         <w:contextualSpacing/>
       </w:pPr>
     </w:p>
-    <w:bookmarkStart w:id="96" w:name="_Toc16233522"/>
-    <w:bookmarkStart w:id="97" w:name="_Toc16235182"/>
-    <w:bookmarkStart w:id="98" w:name="_Toc16237998"/>
-    <w:bookmarkStart w:id="99" w:name="_Toc16238021"/>
-    <w:bookmarkStart w:id="100" w:name="_Toc16249237"/>
     <w:p>
       <w:pPr>
         <w:ind w:firstLine="709"/>
         <w:contextualSpacing/>
       </w:pPr>
+      <w:bookmarkStart w:id="100" w:name="_Toc16233522"/>
+      <w:bookmarkStart w:id="101" w:name="_Toc16235182"/>
+      <w:bookmarkStart w:id="102" w:name="_Toc16237998"/>
+      <w:bookmarkStart w:id="103" w:name="_Toc16238021"/>
+      <w:bookmarkStart w:id="104" w:name="_Toc16249237"/>
       <w:r>
         <w:rPr>
           <w:noProof/>
@@ -16538,11 +16623,11 @@
           </mc:Fallback>
         </mc:AlternateContent>
       </w:r>
-      <w:bookmarkEnd w:id="96"/>
-      <w:bookmarkEnd w:id="97"/>
-      <w:bookmarkEnd w:id="98"/>
-      <w:bookmarkEnd w:id="99"/>
       <w:bookmarkEnd w:id="100"/>
+      <w:bookmarkEnd w:id="101"/>
+      <w:bookmarkEnd w:id="102"/>
+      <w:bookmarkEnd w:id="103"/>
+      <w:bookmarkEnd w:id="104"/>
     </w:p>
     <w:p>
       <w:pPr>
@@ -16868,7 +16953,7 @@
       </w:pPr>
     </w:p>
   </w:comment>
-  <w:comment w:id="88" w:author="Iasmin Marques" w:date="2025-03-14T13:21:00Z" w:initials="IM">
+  <w:comment w:id="92" w:author="Iasmin Marques" w:date="2025-03-14T13:21:00Z" w:initials="IM">
     <w:p>
       <w:pPr>
         <w:pStyle w:val="Textodecomentrio"/>
@@ -16884,7 +16969,7 @@
       </w:r>
     </w:p>
   </w:comment>
-  <w:comment w:id="89" w:author="Iasmin Marques" w:date="2025-07-16T11:41:00Z" w:initials="IM">
+  <w:comment w:id="93" w:author="Iasmin Marques" w:date="2025-07-16T11:41:00Z" w:initials="IM">
     <w:p>
       <w:pPr>
         <w:pStyle w:val="Textodecomentrio"/>
@@ -16905,7 +16990,7 @@
       </w:pPr>
     </w:p>
   </w:comment>
-  <w:comment w:id="90" w:author="Iasmin Marques" w:date="2025-07-21T14:22:00Z" w:initials="IM">
+  <w:comment w:id="94" w:author="Iasmin Marques" w:date="2025-07-21T14:22:00Z" w:initials="IM">
     <w:p>
       <w:pPr>
         <w:pStyle w:val="Textodecomentrio"/>
@@ -16926,7 +17011,7 @@
       </w:pPr>
     </w:p>
   </w:comment>
-  <w:comment w:id="93" w:author="Iasmin Marques" w:date="2025-07-16T13:58:00Z" w:initials="IM">
+  <w:comment w:id="97" w:author="Iasmin Marques" w:date="2025-07-16T13:58:00Z" w:initials="IM">
     <w:p>
       <w:pPr>
         <w:pStyle w:val="Textodecomentrio"/>

</xml_diff>